<commit_message>
Histoire T8 : unité 4 style T5 — royaumes malgaches XVe-XIXe (2 séances, docs : Mayeur 1777, Grandidier)
Co-authored-by: arena-agent <297053741+arena-agent@users.noreply.github.com>
</commit_message>
<xml_diff>
--- a/manuel-histoire-t8/Manuel_Histoire_T8_UNITE4.docx
+++ b/manuel-histoire-t8/Manuel_Histoire_T8_UNITE4.docx
@@ -1819,152 +1819,152 @@
                 <w:szCs w:val="20"/>
                 <w:rFonts w:ascii="Times New Roman" w:cs="Times New Roman" w:eastAsia="Times New Roman" w:hAnsi="Times New Roman"/>
               </w:rPr>
-              <w:t xml:space="preserve">3. Observation</w:t>
-            </w:r>
-          </w:p>
-        </w:tc>
-        <w:tc>
-          <w:tcPr>
-            <w:tcMar>
-              <w:top w:type="dxa" w:w="80"/>
-              <w:left w:type="dxa" w:w="80"/>
-              <w:bottom w:type="dxa" w:w="80"/>
-              <w:right w:type="dxa" w:w="80"/>
-            </w:tcMar>
-          </w:tcPr>
-          <w:p>
-            <w:pPr>
-              <w:spacing w:after="40"/>
-              <w:jc w:val="left"/>
-            </w:pPr>
-            <w:r>
-              <w:rPr>
-                <w:b w:val="false"/>
-                <w:bCs w:val="false"/>
-                <w:i w:val="false"/>
-                <w:iCs w:val="false"/>
-                <w:color w:val="000000"/>
-                <w:sz w:val="20"/>
-                <w:szCs w:val="20"/>
-                <w:rFonts w:ascii="Times New Roman" w:cs="Times New Roman" w:eastAsia="Times New Roman" w:hAnsi="Times New Roman"/>
-              </w:rPr>
-              <w:t xml:space="preserve">Sur une carte muette, place : Antakarana tout au nord, Boina au nord-ouest, Menabe à l’ouest, Mahafaly et Androy au sud, Antemoro au sud-est, Betsimisaraka à l’est, Imerina au centre — tu viens de reconstituer la carte politique de l’île avant le XIXᵉ siècle.</w:t>
-            </w:r>
-          </w:p>
-        </w:tc>
-        <w:tc>
-          <w:tcPr>
-            <w:tcMar>
-              <w:top w:type="dxa" w:w="80"/>
-              <w:left w:type="dxa" w:w="80"/>
-              <w:bottom w:type="dxa" w:w="80"/>
-              <w:right w:type="dxa" w:w="80"/>
-            </w:tcMar>
-          </w:tcPr>
-          <w:p>
-            <w:pPr>
-              <w:spacing w:after="40"/>
-              <w:jc w:val="left"/>
-            </w:pPr>
-            <w:r>
-              <w:rPr>
-                <w:b w:val="false"/>
-                <w:bCs w:val="false"/>
-                <w:i w:val="false"/>
-                <w:iCs w:val="false"/>
-                <w:color w:val="000000"/>
-                <w:sz w:val="20"/>
-                <w:szCs w:val="20"/>
-                <w:rFonts w:ascii="Times New Roman" w:cs="Times New Roman" w:eastAsia="Times New Roman" w:hAnsi="Times New Roman"/>
-              </w:rPr>
-              <w:t xml:space="preserve">Observent l’exemple résolu.</w:t>
-            </w:r>
-          </w:p>
-        </w:tc>
-        <w:tc>
-          <w:tcPr>
-            <w:tcMar>
-              <w:top w:type="dxa" w:w="80"/>
-              <w:left w:type="dxa" w:w="80"/>
-              <w:bottom w:type="dxa" w:w="80"/>
-              <w:right w:type="dxa" w:w="80"/>
-            </w:tcMar>
-          </w:tcPr>
-          <w:p>
-            <w:pPr>
-              <w:spacing w:after="40"/>
-              <w:jc w:val="left"/>
-            </w:pPr>
-            <w:r>
-              <w:rPr>
-                <w:b w:val="false"/>
-                <w:bCs w:val="false"/>
-                <w:i w:val="false"/>
-                <w:iCs w:val="false"/>
-                <w:color w:val="000000"/>
-                <w:sz w:val="20"/>
-                <w:szCs w:val="20"/>
-                <w:rFonts w:ascii="Times New Roman" w:cs="Times New Roman" w:eastAsia="Times New Roman" w:hAnsi="Times New Roman"/>
-              </w:rPr>
-              <w:t xml:space="preserve">Observation dirigée</w:t>
-            </w:r>
-          </w:p>
-        </w:tc>
-        <w:tc>
-          <w:tcPr>
-            <w:tcMar>
-              <w:top w:type="dxa" w:w="80"/>
-              <w:left w:type="dxa" w:w="80"/>
-              <w:bottom w:type="dxa" w:w="80"/>
-              <w:right w:type="dxa" w:w="80"/>
-            </w:tcMar>
-          </w:tcPr>
-          <w:p>
-            <w:pPr>
-              <w:spacing w:after="40"/>
-              <w:jc w:val="left"/>
-            </w:pPr>
-            <w:r>
-              <w:rPr>
-                <w:b w:val="false"/>
-                <w:bCs w:val="false"/>
-                <w:i w:val="false"/>
-                <w:iCs w:val="false"/>
-                <w:color w:val="000000"/>
-                <w:sz w:val="20"/>
-                <w:szCs w:val="20"/>
-                <w:rFonts w:ascii="Times New Roman" w:cs="Times New Roman" w:eastAsia="Times New Roman" w:hAnsi="Times New Roman"/>
-              </w:rPr>
-              <w:t xml:space="preserve">Document imprimé</w:t>
-            </w:r>
-          </w:p>
-        </w:tc>
-        <w:tc>
-          <w:tcPr>
-            <w:tcMar>
-              <w:top w:type="dxa" w:w="80"/>
-              <w:left w:type="dxa" w:w="80"/>
-              <w:bottom w:type="dxa" w:w="80"/>
-              <w:right w:type="dxa" w:w="80"/>
-            </w:tcMar>
-          </w:tcPr>
-          <w:p>
-            <w:pPr>
-              <w:spacing w:after="40"/>
-              <w:jc w:val="left"/>
-            </w:pPr>
-            <w:r>
-              <w:rPr>
-                <w:b w:val="false"/>
-                <w:bCs w:val="false"/>
-                <w:i w:val="false"/>
-                <w:iCs w:val="false"/>
-                <w:color w:val="000000"/>
-                <w:sz w:val="20"/>
-                <w:szCs w:val="20"/>
-                <w:rFonts w:ascii="Times New Roman" w:cs="Times New Roman" w:eastAsia="Times New Roman" w:hAnsi="Times New Roman"/>
-              </w:rPr>
-              <w:t xml:space="preserve">Compréhension</w:t>
+              <w:t xml:space="preserve">3. Développement</w:t>
+            </w:r>
+          </w:p>
+        </w:tc>
+        <w:tc>
+          <w:tcPr>
+            <w:tcMar>
+              <w:top w:type="dxa" w:w="80"/>
+              <w:left w:type="dxa" w:w="80"/>
+              <w:bottom w:type="dxa" w:w="80"/>
+              <w:right w:type="dxa" w:w="80"/>
+            </w:tcMar>
+          </w:tcPr>
+          <w:p>
+            <w:pPr>
+              <w:spacing w:after="40"/>
+              <w:jc w:val="left"/>
+            </w:pPr>
+            <w:r>
+              <w:rPr>
+                <w:b w:val="false"/>
+                <w:bCs w:val="false"/>
+                <w:i w:val="false"/>
+                <w:iCs w:val="false"/>
+                <w:color w:val="000000"/>
+                <w:sz w:val="20"/>
+                <w:szCs w:val="20"/>
+                <w:rFonts w:ascii="Times New Roman" w:cs="Times New Roman" w:eastAsia="Times New Roman" w:hAnsi="Times New Roman"/>
+              </w:rPr>
+              <w:t xml:space="preserve">Développe la leçon partie par partie : Une île immense et cloisonnée ; Le tour de l’île, royaume par royaume ; Deux dynasties dominent la mémoire.</w:t>
+            </w:r>
+          </w:p>
+        </w:tc>
+        <w:tc>
+          <w:tcPr>
+            <w:tcMar>
+              <w:top w:type="dxa" w:w="80"/>
+              <w:left w:type="dxa" w:w="80"/>
+              <w:bottom w:type="dxa" w:w="80"/>
+              <w:right w:type="dxa" w:w="80"/>
+            </w:tcMar>
+          </w:tcPr>
+          <w:p>
+            <w:pPr>
+              <w:spacing w:after="40"/>
+              <w:jc w:val="left"/>
+            </w:pPr>
+            <w:r>
+              <w:rPr>
+                <w:b w:val="false"/>
+                <w:bCs w:val="false"/>
+                <w:i w:val="false"/>
+                <w:iCs w:val="false"/>
+                <w:color w:val="000000"/>
+                <w:sz w:val="20"/>
+                <w:szCs w:val="20"/>
+                <w:rFonts w:ascii="Times New Roman" w:cs="Times New Roman" w:eastAsia="Times New Roman" w:hAnsi="Times New Roman"/>
+              </w:rPr>
+              <w:t xml:space="preserve">Écoutent, répondent aux questions et notent les mots-clés.</w:t>
+            </w:r>
+          </w:p>
+        </w:tc>
+        <w:tc>
+          <w:tcPr>
+            <w:tcMar>
+              <w:top w:type="dxa" w:w="80"/>
+              <w:left w:type="dxa" w:w="80"/>
+              <w:bottom w:type="dxa" w:w="80"/>
+              <w:right w:type="dxa" w:w="80"/>
+            </w:tcMar>
+          </w:tcPr>
+          <w:p>
+            <w:pPr>
+              <w:spacing w:after="40"/>
+              <w:jc w:val="left"/>
+            </w:pPr>
+            <w:r>
+              <w:rPr>
+                <w:b w:val="false"/>
+                <w:bCs w:val="false"/>
+                <w:i w:val="false"/>
+                <w:iCs w:val="false"/>
+                <w:color w:val="000000"/>
+                <w:sz w:val="20"/>
+                <w:szCs w:val="20"/>
+                <w:rFonts w:ascii="Times New Roman" w:cs="Times New Roman" w:eastAsia="Times New Roman" w:hAnsi="Times New Roman"/>
+              </w:rPr>
+              <w:t xml:space="preserve">Exposé interactif, questions-réponses</w:t>
+            </w:r>
+          </w:p>
+        </w:tc>
+        <w:tc>
+          <w:tcPr>
+            <w:tcMar>
+              <w:top w:type="dxa" w:w="80"/>
+              <w:left w:type="dxa" w:w="80"/>
+              <w:bottom w:type="dxa" w:w="80"/>
+              <w:right w:type="dxa" w:w="80"/>
+            </w:tcMar>
+          </w:tcPr>
+          <w:p>
+            <w:pPr>
+              <w:spacing w:after="40"/>
+              <w:jc w:val="left"/>
+            </w:pPr>
+            <w:r>
+              <w:rPr>
+                <w:b w:val="false"/>
+                <w:bCs w:val="false"/>
+                <w:i w:val="false"/>
+                <w:iCs w:val="false"/>
+                <w:color w:val="000000"/>
+                <w:sz w:val="20"/>
+                <w:szCs w:val="20"/>
+                <w:rFonts w:ascii="Times New Roman" w:cs="Times New Roman" w:eastAsia="Times New Roman" w:hAnsi="Times New Roman"/>
+              </w:rPr>
+              <w:t xml:space="preserve">Tableau, frises, cartes</w:t>
+            </w:r>
+          </w:p>
+        </w:tc>
+        <w:tc>
+          <w:tcPr>
+            <w:tcMar>
+              <w:top w:type="dxa" w:w="80"/>
+              <w:left w:type="dxa" w:w="80"/>
+              <w:bottom w:type="dxa" w:w="80"/>
+              <w:right w:type="dxa" w:w="80"/>
+            </w:tcMar>
+          </w:tcPr>
+          <w:p>
+            <w:pPr>
+              <w:spacing w:after="40"/>
+              <w:jc w:val="left"/>
+            </w:pPr>
+            <w:r>
+              <w:rPr>
+                <w:b w:val="false"/>
+                <w:bCs w:val="false"/>
+                <w:i w:val="false"/>
+                <w:iCs w:val="false"/>
+                <w:color w:val="000000"/>
+                <w:sz w:val="20"/>
+                <w:szCs w:val="20"/>
+                <w:rFonts w:ascii="Times New Roman" w:cs="Times New Roman" w:eastAsia="Times New Roman" w:hAnsi="Times New Roman"/>
+              </w:rPr>
+              <w:t xml:space="preserve">Attention, participation</w:t>
             </w:r>
           </w:p>
         </w:tc>
@@ -1995,152 +1995,152 @@
                 <w:szCs w:val="20"/>
                 <w:rFonts w:ascii="Times New Roman" w:cs="Times New Roman" w:eastAsia="Times New Roman" w:hAnsi="Times New Roman"/>
               </w:rPr>
-              <w:t xml:space="preserve">4. Analyse</w:t>
-            </w:r>
-          </w:p>
-        </w:tc>
-        <w:tc>
-          <w:tcPr>
-            <w:tcMar>
-              <w:top w:type="dxa" w:w="80"/>
-              <w:left w:type="dxa" w:w="80"/>
-              <w:bottom w:type="dxa" w:w="80"/>
-              <w:right w:type="dxa" w:w="80"/>
-            </w:tcMar>
-          </w:tcPr>
-          <w:p>
-            <w:pPr>
-              <w:spacing w:after="40"/>
-              <w:jc w:val="left"/>
-            </w:pPr>
-            <w:r>
-              <w:rPr>
-                <w:b w:val="false"/>
-                <w:bCs w:val="false"/>
-                <w:i w:val="false"/>
-                <w:iCs w:val="false"/>
-                <w:color w:val="000000"/>
-                <w:sz w:val="20"/>
-                <w:szCs w:val="20"/>
-                <w:rFonts w:ascii="Times New Roman" w:cs="Times New Roman" w:eastAsia="Times New Roman" w:hAnsi="Times New Roman"/>
-              </w:rPr>
-              <w:t xml:space="preserve">Guide l’analyse : Pourquoi tant de royaumes ? La géographie de l’île y est pour beaucoup : immense — presque 1 600 km du nord au sud —, cloisonnée par les falaises de l’escarpement oriental, les fleuves de l’ouest et les étendues arides du sud, Madagascar a vu ses communautés se développer longtemps chacune de son côté. Au nord, le royaume antakarana contrôle la pointe de l’île et ses baies. À l’ouest et au nord-ouest s’étendent les puissants royaumes sakalava — le Menabe au centre-ouest, le Boina au nord-ouest — fondés par des dynasties venues du sud-ouest ; leurs souverains règnent sur d’immenses pâturages à zébus et sur les ports qui commercent avec les boutres arabes et les navires européens. Au sud, l’Androy et le pays mahafaly vivent de l’élevage dans un milieu sec. Au sud-est, les Antemoro — héritiers d’ancêtres venus par l’océan Indien et détenteurs des sorabe, manuscrits en caractères arabes — et les Antanosy. Sur la côte est, les Betsimisaraka forment au XVIIIᵉ siècle une confédération qui unifie les peuples du littoral. Enfin, sur les Hautes Terres centrales, le Betsileo au sud et l’Imerina au nord : ce dernier, autour d’Antananarivo, est gouverné par une dynastie qui, à la fin du XVIIIᵉ siècle, unifiera son territoire — puis, au XIXᵉ, étendra son autorité sur la majeure partie de l’île. Retiens la logique de la carte : chaque région naturelle porte un royaume, et deux dynasties dominent la mémoire historique — celle du Nord-Ouest sakalava et celle de l’Imerina.</w:t>
-            </w:r>
-          </w:p>
-        </w:tc>
-        <w:tc>
-          <w:tcPr>
-            <w:tcMar>
-              <w:top w:type="dxa" w:w="80"/>
-              <w:left w:type="dxa" w:w="80"/>
-              <w:bottom w:type="dxa" w:w="80"/>
-              <w:right w:type="dxa" w:w="80"/>
-            </w:tcMar>
-          </w:tcPr>
-          <w:p>
-            <w:pPr>
-              <w:spacing w:after="40"/>
-              <w:jc w:val="left"/>
-            </w:pPr>
-            <w:r>
-              <w:rPr>
-                <w:b w:val="false"/>
-                <w:bCs w:val="false"/>
-                <w:i w:val="false"/>
-                <w:iCs w:val="false"/>
-                <w:color w:val="000000"/>
-                <w:sz w:val="20"/>
-                <w:szCs w:val="20"/>
-                <w:rFonts w:ascii="Times New Roman" w:cs="Times New Roman" w:eastAsia="Times New Roman" w:hAnsi="Times New Roman"/>
-              </w:rPr>
-              <w:t xml:space="preserve">Expliquent la démarche et vérifient le résultat.</w:t>
-            </w:r>
-          </w:p>
-        </w:tc>
-        <w:tc>
-          <w:tcPr>
-            <w:tcMar>
-              <w:top w:type="dxa" w:w="80"/>
-              <w:left w:type="dxa" w:w="80"/>
-              <w:bottom w:type="dxa" w:w="80"/>
-              <w:right w:type="dxa" w:w="80"/>
-            </w:tcMar>
-          </w:tcPr>
-          <w:p>
-            <w:pPr>
-              <w:spacing w:after="40"/>
-              <w:jc w:val="left"/>
-            </w:pPr>
-            <w:r>
-              <w:rPr>
-                <w:b w:val="false"/>
-                <w:bCs w:val="false"/>
-                <w:i w:val="false"/>
-                <w:iCs w:val="false"/>
-                <w:color w:val="000000"/>
-                <w:sz w:val="20"/>
-                <w:szCs w:val="20"/>
-                <w:rFonts w:ascii="Times New Roman" w:cs="Times New Roman" w:eastAsia="Times New Roman" w:hAnsi="Times New Roman"/>
-              </w:rPr>
-              <w:t xml:space="preserve">Recherche en binômes</w:t>
-            </w:r>
-          </w:p>
-        </w:tc>
-        <w:tc>
-          <w:tcPr>
-            <w:tcMar>
-              <w:top w:type="dxa" w:w="80"/>
-              <w:left w:type="dxa" w:w="80"/>
-              <w:bottom w:type="dxa" w:w="80"/>
-              <w:right w:type="dxa" w:w="80"/>
-            </w:tcMar>
-          </w:tcPr>
-          <w:p>
-            <w:pPr>
-              <w:spacing w:after="40"/>
-              <w:jc w:val="left"/>
-            </w:pPr>
-            <w:r>
-              <w:rPr>
-                <w:b w:val="false"/>
-                <w:bCs w:val="false"/>
-                <w:i w:val="false"/>
-                <w:iCs w:val="false"/>
-                <w:color w:val="000000"/>
-                <w:sz w:val="20"/>
-                <w:szCs w:val="20"/>
-                <w:rFonts w:ascii="Times New Roman" w:cs="Times New Roman" w:eastAsia="Times New Roman" w:hAnsi="Times New Roman"/>
-              </w:rPr>
-              <w:t xml:space="preserve">Documents, cartes, frises</w:t>
-            </w:r>
-          </w:p>
-        </w:tc>
-        <w:tc>
-          <w:tcPr>
-            <w:tcMar>
-              <w:top w:type="dxa" w:w="80"/>
-              <w:left w:type="dxa" w:w="80"/>
-              <w:bottom w:type="dxa" w:w="80"/>
-              <w:right w:type="dxa" w:w="80"/>
-            </w:tcMar>
-          </w:tcPr>
-          <w:p>
-            <w:pPr>
-              <w:spacing w:after="40"/>
-              <w:jc w:val="left"/>
-            </w:pPr>
-            <w:r>
-              <w:rPr>
-                <w:b w:val="false"/>
-                <w:bCs w:val="false"/>
-                <w:i w:val="false"/>
-                <w:iCs w:val="false"/>
-                <w:color w:val="000000"/>
-                <w:sz w:val="20"/>
-                <w:szCs w:val="20"/>
-                <w:rFonts w:ascii="Times New Roman" w:cs="Times New Roman" w:eastAsia="Times New Roman" w:hAnsi="Times New Roman"/>
-              </w:rPr>
-              <w:t xml:space="preserve">Raisonnement</w:t>
+              <w:t xml:space="preserve">4. Étude de document</w:t>
+            </w:r>
+          </w:p>
+        </w:tc>
+        <w:tc>
+          <w:tcPr>
+            <w:tcMar>
+              <w:top w:type="dxa" w:w="80"/>
+              <w:left w:type="dxa" w:w="80"/>
+              <w:bottom w:type="dxa" w:w="80"/>
+              <w:right w:type="dxa" w:w="80"/>
+            </w:tcMar>
+          </w:tcPr>
+          <w:p>
+            <w:pPr>
+              <w:spacing w:after="40"/>
+              <w:jc w:val="left"/>
+            </w:pPr>
+            <w:r>
+              <w:rPr>
+                <w:b w:val="false"/>
+                <w:bCs w:val="false"/>
+                <w:i w:val="false"/>
+                <w:iCs w:val="false"/>
+                <w:color w:val="000000"/>
+                <w:sz w:val="20"/>
+                <w:szCs w:val="20"/>
+                <w:rFonts w:ascii="Times New Roman" w:cs="Times New Roman" w:eastAsia="Times New Roman" w:hAnsi="Times New Roman"/>
+              </w:rPr>
+              <w:t xml:space="preserve">Fait lire le document « Un voyageur traverse l’île jusqu’en Imerina » (d’après Nicolas Mayeur, Voyage au pays d’Ancove (1777) — extrait adapté), puis pose les questions.</w:t>
+            </w:r>
+          </w:p>
+        </w:tc>
+        <w:tc>
+          <w:tcPr>
+            <w:tcMar>
+              <w:top w:type="dxa" w:w="80"/>
+              <w:left w:type="dxa" w:w="80"/>
+              <w:bottom w:type="dxa" w:w="80"/>
+              <w:right w:type="dxa" w:w="80"/>
+            </w:tcMar>
+          </w:tcPr>
+          <w:p>
+            <w:pPr>
+              <w:spacing w:after="40"/>
+              <w:jc w:val="left"/>
+            </w:pPr>
+            <w:r>
+              <w:rPr>
+                <w:b w:val="false"/>
+                <w:bCs w:val="false"/>
+                <w:i w:val="false"/>
+                <w:iCs w:val="false"/>
+                <w:color w:val="000000"/>
+                <w:sz w:val="20"/>
+                <w:szCs w:val="20"/>
+                <w:rFonts w:ascii="Times New Roman" w:cs="Times New Roman" w:eastAsia="Times New Roman" w:hAnsi="Times New Roman"/>
+              </w:rPr>
+              <w:t xml:space="preserve">Lisent le document, répondent aux questions et critiquent la source.</w:t>
+            </w:r>
+          </w:p>
+        </w:tc>
+        <w:tc>
+          <w:tcPr>
+            <w:tcMar>
+              <w:top w:type="dxa" w:w="80"/>
+              <w:left w:type="dxa" w:w="80"/>
+              <w:bottom w:type="dxa" w:w="80"/>
+              <w:right w:type="dxa" w:w="80"/>
+            </w:tcMar>
+          </w:tcPr>
+          <w:p>
+            <w:pPr>
+              <w:spacing w:after="40"/>
+              <w:jc w:val="left"/>
+            </w:pPr>
+            <w:r>
+              <w:rPr>
+                <w:b w:val="false"/>
+                <w:bCs w:val="false"/>
+                <w:i w:val="false"/>
+                <w:iCs w:val="false"/>
+                <w:color w:val="000000"/>
+                <w:sz w:val="20"/>
+                <w:szCs w:val="20"/>
+                <w:rFonts w:ascii="Times New Roman" w:cs="Times New Roman" w:eastAsia="Times New Roman" w:hAnsi="Times New Roman"/>
+              </w:rPr>
+              <w:t xml:space="preserve">Observation dirigée, travail en binômes</w:t>
+            </w:r>
+          </w:p>
+        </w:tc>
+        <w:tc>
+          <w:tcPr>
+            <w:tcMar>
+              <w:top w:type="dxa" w:w="80"/>
+              <w:left w:type="dxa" w:w="80"/>
+              <w:bottom w:type="dxa" w:w="80"/>
+              <w:right w:type="dxa" w:w="80"/>
+            </w:tcMar>
+          </w:tcPr>
+          <w:p>
+            <w:pPr>
+              <w:spacing w:after="40"/>
+              <w:jc w:val="left"/>
+            </w:pPr>
+            <w:r>
+              <w:rPr>
+                <w:b w:val="false"/>
+                <w:bCs w:val="false"/>
+                <w:i w:val="false"/>
+                <w:iCs w:val="false"/>
+                <w:color w:val="000000"/>
+                <w:sz w:val="20"/>
+                <w:szCs w:val="20"/>
+                <w:rFonts w:ascii="Times New Roman" w:cs="Times New Roman" w:eastAsia="Times New Roman" w:hAnsi="Times New Roman"/>
+              </w:rPr>
+              <w:t xml:space="preserve">Document imprimé</w:t>
+            </w:r>
+          </w:p>
+        </w:tc>
+        <w:tc>
+          <w:tcPr>
+            <w:tcMar>
+              <w:top w:type="dxa" w:w="80"/>
+              <w:left w:type="dxa" w:w="80"/>
+              <w:bottom w:type="dxa" w:w="80"/>
+              <w:right w:type="dxa" w:w="80"/>
+            </w:tcMar>
+          </w:tcPr>
+          <w:p>
+            <w:pPr>
+              <w:spacing w:after="40"/>
+              <w:jc w:val="left"/>
+            </w:pPr>
+            <w:r>
+              <w:rPr>
+                <w:b w:val="false"/>
+                <w:bCs w:val="false"/>
+                <w:i w:val="false"/>
+                <w:iCs w:val="false"/>
+                <w:color w:val="000000"/>
+                <w:sz w:val="20"/>
+                <w:szCs w:val="20"/>
+                <w:rFonts w:ascii="Times New Roman" w:cs="Times New Roman" w:eastAsia="Times New Roman" w:hAnsi="Times New Roman"/>
+              </w:rPr>
+              <w:t xml:space="preserve">Esprit critique</w:t>
             </w:r>
           </w:p>
         </w:tc>
@@ -2746,7 +2746,26 @@
     </w:p>
     <w:p>
       <w:pPr>
-        <w:spacing w:after="110" w:line="300"/>
+        <w:spacing w:after="160" w:line="300"/>
+        <w:jc w:val="center"/>
+      </w:pPr>
+      <w:r>
+        <w:rPr>
+          <w:b w:val="false"/>
+          <w:bCs w:val="false"/>
+          <w:i/>
+          <w:iCs/>
+          <w:color w:val="000000"/>
+          <w:sz w:val="21"/>
+          <w:szCs w:val="21"/>
+          <w:rFonts w:ascii="Times New Roman" w:cs="Times New Roman" w:eastAsia="Times New Roman" w:hAnsi="Times New Roman"/>
+        </w:rPr>
+        <w:t xml:space="preserve">Chaque grande région naturelle de l’île porte un royaume : la carte politique épouse la carte du relief.</w:t>
+      </w:r>
+    </w:p>
+    <w:p>
+      <w:pPr>
+        <w:spacing w:after="80" w:line="300"/>
         <w:jc w:val="both"/>
       </w:pPr>
       <w:r>
@@ -2756,31 +2775,88 @@
           <w:i w:val="false"/>
           <w:iCs w:val="false"/>
           <w:color w:val="2E7D32"/>
-          <w:sz w:val="24"/>
-          <w:szCs w:val="24"/>
-          <w:rFonts w:ascii="Times New Roman" w:cs="Times New Roman" w:eastAsia="Times New Roman" w:hAnsi="Times New Roman"/>
-        </w:rPr>
-        <w:t xml:space="preserve">Définition — </w:t>
-      </w:r>
+          <w:sz w:val="26"/>
+          <w:szCs w:val="26"/>
+          <w:rFonts w:ascii="Times New Roman" w:cs="Times New Roman" w:eastAsia="Times New Roman" w:hAnsi="Times New Roman"/>
+        </w:rPr>
+        <w:t xml:space="preserve">1. Une île immense et cloisonnée</w:t>
+      </w:r>
+    </w:p>
+    <w:p>
+      <w:pPr>
+        <w:spacing w:after="100" w:line="300"/>
+        <w:jc w:val="both"/>
+      </w:pPr>
+      <w:r>
+        <w:rPr>
+          <w:b w:val="false"/>
+          <w:bCs w:val="false"/>
+          <w:i w:val="false"/>
+          <w:iCs w:val="false"/>
+          <w:color w:val="000000"/>
+          <w:sz w:val="24"/>
+          <w:szCs w:val="24"/>
+          <w:rFonts w:ascii="Times New Roman" w:cs="Times New Roman" w:eastAsia="Times New Roman" w:hAnsi="Times New Roman"/>
+        </w:rPr>
+        <w:t xml:space="preserve">Pourquoi tant de royaumes ? La géographie de l’île y est pour beaucoup : immense — presque 1 600 km du nord au sud —, cloisonnée par les falaises de l’escarpement oriental, les fleuves de l’ouest et les étendues arides du sud, Madagascar a vu ses communautés se développer longtemps chacune de son côté.</w:t>
+      </w:r>
+    </w:p>
+    <w:p>
+      <w:pPr>
+        <w:spacing w:after="80" w:line="300"/>
+        <w:jc w:val="both"/>
+      </w:pPr>
       <w:r>
         <w:rPr>
           <w:b/>
           <w:bCs/>
           <w:i w:val="false"/>
           <w:iCs w:val="false"/>
+          <w:color w:val="2E7D32"/>
+          <w:sz w:val="26"/>
+          <w:szCs w:val="26"/>
+          <w:rFonts w:ascii="Times New Roman" w:cs="Times New Roman" w:eastAsia="Times New Roman" w:hAnsi="Times New Roman"/>
+        </w:rPr>
+        <w:t xml:space="preserve">2. Le tour de l’île, royaume par royaume</w:t>
+      </w:r>
+    </w:p>
+    <w:p>
+      <w:pPr>
+        <w:spacing w:after="100" w:line="300"/>
+        <w:jc w:val="both"/>
+      </w:pPr>
+      <w:r>
+        <w:rPr>
+          <w:b w:val="false"/>
+          <w:bCs w:val="false"/>
+          <w:i w:val="false"/>
+          <w:iCs w:val="false"/>
           <w:color w:val="000000"/>
           <w:sz w:val="24"/>
           <w:szCs w:val="24"/>
           <w:rFonts w:ascii="Times New Roman" w:cs="Times New Roman" w:eastAsia="Times New Roman" w:hAnsi="Times New Roman"/>
         </w:rPr>
-        <w:t xml:space="preserve">Du XVᵉ au XIXᵉ siècle, Madagascar est partagé entre de nombreux royaumes : ceux du Nord (Antakarana), du Sud (Androy, Mahafaly), du Sud-Est (Antemoro, Antanosy), de l’Est (Betsimisaraka), de l’Ouest et du Nord-Ouest (royaumes sakalava), et des Hautes Terres (Imerina, Betsileo). Deux dynasties — familles régnantes — sont particulièrement célèbres : celles du Nord-Ouest (sakalava) et de l’Imerina.</w:t>
-      </w:r>
-    </w:p>
-    <w:p>
-      <w:pPr>
-        <w:spacing w:after="110" w:line="300"/>
+        <w:t xml:space="preserve">Faisons le tour de la carte :</w:t>
+      </w:r>
+    </w:p>
+    <w:p>
+      <w:pPr>
+        <w:spacing w:after="60" w:line="300"/>
         <w:jc w:val="both"/>
       </w:pPr>
+      <w:r>
+        <w:rPr>
+          <w:b w:val="false"/>
+          <w:bCs w:val="false"/>
+          <w:i w:val="false"/>
+          <w:iCs w:val="false"/>
+          <w:color w:val="000000"/>
+          <w:sz w:val="24"/>
+          <w:szCs w:val="24"/>
+          <w:rFonts w:ascii="Times New Roman" w:cs="Times New Roman" w:eastAsia="Times New Roman" w:hAnsi="Times New Roman"/>
+        </w:rPr>
+        <w:t xml:space="preserve">• au nord, le royaume </w:t>
+      </w:r>
       <w:r>
         <w:rPr>
           <w:b/>
@@ -2792,7 +2868,7 @@
           <w:szCs w:val="24"/>
           <w:rFonts w:ascii="Times New Roman" w:cs="Times New Roman" w:eastAsia="Times New Roman" w:hAnsi="Times New Roman"/>
         </w:rPr>
-        <w:t xml:space="preserve">Autrement dit : </w:t>
+        <w:t xml:space="preserve">antakarana</w:t>
       </w:r>
       <w:r>
         <w:rPr>
@@ -2805,12 +2881,12 @@
           <w:szCs w:val="24"/>
           <w:rFonts w:ascii="Times New Roman" w:cs="Times New Roman" w:eastAsia="Times New Roman" w:hAnsi="Times New Roman"/>
         </w:rPr>
-        <w:t xml:space="preserve">avant l’unification du XIXᵉ siècle, chaque grande région de l’île a son ou ses royaumes ; les plus fameuses lignées royales sont celles des Sakalava du Nord-Ouest et des Merina des Hautes Terres.</w:t>
-      </w:r>
-    </w:p>
-    <w:p>
-      <w:pPr>
-        <w:spacing w:after="110" w:line="300"/>
+        <w:t xml:space="preserve"> contrôle la pointe de l’île et ses baies ;</w:t>
+      </w:r>
+    </w:p>
+    <w:p>
+      <w:pPr>
+        <w:spacing w:after="60" w:line="300"/>
         <w:jc w:val="both"/>
       </w:pPr>
       <w:r>
@@ -2824,7 +2900,504 @@
           <w:szCs w:val="24"/>
           <w:rFonts w:ascii="Times New Roman" w:cs="Times New Roman" w:eastAsia="Times New Roman" w:hAnsi="Times New Roman"/>
         </w:rPr>
-        <w:t xml:space="preserve">Pourquoi tant de royaumes ? La géographie de l’île y est pour beaucoup : immense — presque 1 600 km du nord au sud —, cloisonnée par les falaises de l’escarpement oriental, les fleuves de l’ouest et les étendues arides du sud, Madagascar a vu ses communautés se développer longtemps chacune de son côté. Au nord, le royaume antakarana contrôle la pointe de l’île et ses baies. À l’ouest et au nord-ouest s’étendent les puissants royaumes sakalava — le Menabe au centre-ouest, le Boina au nord-ouest — fondés par des dynasties venues du sud-ouest ; leurs souverains règnent sur d’immenses pâturages à zébus et sur les ports qui commercent avec les boutres arabes et les navires européens. Au sud, l’Androy et le pays mahafaly vivent de l’élevage dans un milieu sec. Au sud-est, les Antemoro — héritiers d’ancêtres venus par l’océan Indien et détenteurs des sorabe, manuscrits en caractères arabes — et les Antanosy. Sur la côte est, les Betsimisaraka forment au XVIIIᵉ siècle une confédération qui unifie les peuples du littoral. Enfin, sur les Hautes Terres centrales, le Betsileo au sud et l’Imerina au nord : ce dernier, autour d’Antananarivo, est gouverné par une dynastie qui, à la fin du XVIIIᵉ siècle, unifiera son territoire — puis, au XIXᵉ, étendra son autorité sur la majeure partie de l’île. Retiens la logique de la carte : chaque région naturelle porte un royaume, et deux dynasties dominent la mémoire historique — celle du Nord-Ouest sakalava et celle de l’Imerina.</w:t>
+        <w:t xml:space="preserve">• à l’ouest et au nord-ouest, les puissants royaumes </w:t>
+      </w:r>
+      <w:r>
+        <w:rPr>
+          <w:b/>
+          <w:bCs/>
+          <w:i w:val="false"/>
+          <w:iCs w:val="false"/>
+          <w:color w:val="1F4E79"/>
+          <w:sz w:val="24"/>
+          <w:szCs w:val="24"/>
+          <w:rFonts w:ascii="Times New Roman" w:cs="Times New Roman" w:eastAsia="Times New Roman" w:hAnsi="Times New Roman"/>
+        </w:rPr>
+        <w:t xml:space="preserve">sakalava</w:t>
+      </w:r>
+      <w:r>
+        <w:rPr>
+          <w:b w:val="false"/>
+          <w:bCs w:val="false"/>
+          <w:i w:val="false"/>
+          <w:iCs w:val="false"/>
+          <w:color w:val="000000"/>
+          <w:sz w:val="24"/>
+          <w:szCs w:val="24"/>
+          <w:rFonts w:ascii="Times New Roman" w:cs="Times New Roman" w:eastAsia="Times New Roman" w:hAnsi="Times New Roman"/>
+        </w:rPr>
+        <w:t xml:space="preserve"> — le </w:t>
+      </w:r>
+      <w:r>
+        <w:rPr>
+          <w:b/>
+          <w:bCs/>
+          <w:i w:val="false"/>
+          <w:iCs w:val="false"/>
+          <w:color w:val="1F4E79"/>
+          <w:sz w:val="24"/>
+          <w:szCs w:val="24"/>
+          <w:rFonts w:ascii="Times New Roman" w:cs="Times New Roman" w:eastAsia="Times New Roman" w:hAnsi="Times New Roman"/>
+        </w:rPr>
+        <w:t xml:space="preserve">Menabe</w:t>
+      </w:r>
+      <w:r>
+        <w:rPr>
+          <w:b w:val="false"/>
+          <w:bCs w:val="false"/>
+          <w:i w:val="false"/>
+          <w:iCs w:val="false"/>
+          <w:color w:val="000000"/>
+          <w:sz w:val="24"/>
+          <w:szCs w:val="24"/>
+          <w:rFonts w:ascii="Times New Roman" w:cs="Times New Roman" w:eastAsia="Times New Roman" w:hAnsi="Times New Roman"/>
+        </w:rPr>
+        <w:t xml:space="preserve"> au centre-ouest, le </w:t>
+      </w:r>
+      <w:r>
+        <w:rPr>
+          <w:b/>
+          <w:bCs/>
+          <w:i w:val="false"/>
+          <w:iCs w:val="false"/>
+          <w:color w:val="1F4E79"/>
+          <w:sz w:val="24"/>
+          <w:szCs w:val="24"/>
+          <w:rFonts w:ascii="Times New Roman" w:cs="Times New Roman" w:eastAsia="Times New Roman" w:hAnsi="Times New Roman"/>
+        </w:rPr>
+        <w:t xml:space="preserve">Boina</w:t>
+      </w:r>
+      <w:r>
+        <w:rPr>
+          <w:b w:val="false"/>
+          <w:bCs w:val="false"/>
+          <w:i w:val="false"/>
+          <w:iCs w:val="false"/>
+          <w:color w:val="000000"/>
+          <w:sz w:val="24"/>
+          <w:szCs w:val="24"/>
+          <w:rFonts w:ascii="Times New Roman" w:cs="Times New Roman" w:eastAsia="Times New Roman" w:hAnsi="Times New Roman"/>
+        </w:rPr>
+        <w:t xml:space="preserve"> au nord-ouest — fondés par des </w:t>
+      </w:r>
+      <w:r>
+        <w:rPr>
+          <w:b/>
+          <w:bCs/>
+          <w:i w:val="false"/>
+          <w:iCs w:val="false"/>
+          <w:color w:val="1F4E79"/>
+          <w:sz w:val="24"/>
+          <w:szCs w:val="24"/>
+          <w:rFonts w:ascii="Times New Roman" w:cs="Times New Roman" w:eastAsia="Times New Roman" w:hAnsi="Times New Roman"/>
+        </w:rPr>
+        <w:t xml:space="preserve">dynastie</w:t>
+      </w:r>
+      <w:r>
+        <w:rPr>
+          <w:b w:val="false"/>
+          <w:bCs w:val="false"/>
+          <w:i w:val="false"/>
+          <w:iCs w:val="false"/>
+          <w:color w:val="000000"/>
+          <w:sz w:val="24"/>
+          <w:szCs w:val="24"/>
+          <w:rFonts w:ascii="Times New Roman" w:cs="Times New Roman" w:eastAsia="Times New Roman" w:hAnsi="Times New Roman"/>
+        </w:rPr>
+        <w:t xml:space="preserve">s venues du sud-ouest ; leurs souverains règnent sur d’immenses pâturages à zébus et sur les ports qui commercent avec les boutres arabes et les navires européens ;</w:t>
+      </w:r>
+    </w:p>
+    <w:p>
+      <w:pPr>
+        <w:spacing w:after="60" w:line="300"/>
+        <w:jc w:val="both"/>
+      </w:pPr>
+      <w:r>
+        <w:rPr>
+          <w:b w:val="false"/>
+          <w:bCs w:val="false"/>
+          <w:i w:val="false"/>
+          <w:iCs w:val="false"/>
+          <w:color w:val="000000"/>
+          <w:sz w:val="24"/>
+          <w:szCs w:val="24"/>
+          <w:rFonts w:ascii="Times New Roman" w:cs="Times New Roman" w:eastAsia="Times New Roman" w:hAnsi="Times New Roman"/>
+        </w:rPr>
+        <w:t xml:space="preserve">• au sud, l’</w:t>
+      </w:r>
+      <w:r>
+        <w:rPr>
+          <w:b/>
+          <w:bCs/>
+          <w:i w:val="false"/>
+          <w:iCs w:val="false"/>
+          <w:color w:val="1F4E79"/>
+          <w:sz w:val="24"/>
+          <w:szCs w:val="24"/>
+          <w:rFonts w:ascii="Times New Roman" w:cs="Times New Roman" w:eastAsia="Times New Roman" w:hAnsi="Times New Roman"/>
+        </w:rPr>
+        <w:t xml:space="preserve">Androy</w:t>
+      </w:r>
+      <w:r>
+        <w:rPr>
+          <w:b w:val="false"/>
+          <w:bCs w:val="false"/>
+          <w:i w:val="false"/>
+          <w:iCs w:val="false"/>
+          <w:color w:val="000000"/>
+          <w:sz w:val="24"/>
+          <w:szCs w:val="24"/>
+          <w:rFonts w:ascii="Times New Roman" w:cs="Times New Roman" w:eastAsia="Times New Roman" w:hAnsi="Times New Roman"/>
+        </w:rPr>
+        <w:t xml:space="preserve"> et le pays </w:t>
+      </w:r>
+      <w:r>
+        <w:rPr>
+          <w:b/>
+          <w:bCs/>
+          <w:i w:val="false"/>
+          <w:iCs w:val="false"/>
+          <w:color w:val="1F4E79"/>
+          <w:sz w:val="24"/>
+          <w:szCs w:val="24"/>
+          <w:rFonts w:ascii="Times New Roman" w:cs="Times New Roman" w:eastAsia="Times New Roman" w:hAnsi="Times New Roman"/>
+        </w:rPr>
+        <w:t xml:space="preserve">mahafaly</w:t>
+      </w:r>
+      <w:r>
+        <w:rPr>
+          <w:b w:val="false"/>
+          <w:bCs w:val="false"/>
+          <w:i w:val="false"/>
+          <w:iCs w:val="false"/>
+          <w:color w:val="000000"/>
+          <w:sz w:val="24"/>
+          <w:szCs w:val="24"/>
+          <w:rFonts w:ascii="Times New Roman" w:cs="Times New Roman" w:eastAsia="Times New Roman" w:hAnsi="Times New Roman"/>
+        </w:rPr>
+        <w:t xml:space="preserve"> vivent de l’élevage dans un milieu sec ;</w:t>
+      </w:r>
+    </w:p>
+    <w:p>
+      <w:pPr>
+        <w:spacing w:after="60" w:line="300"/>
+        <w:jc w:val="both"/>
+      </w:pPr>
+      <w:r>
+        <w:rPr>
+          <w:b w:val="false"/>
+          <w:bCs w:val="false"/>
+          <w:i w:val="false"/>
+          <w:iCs w:val="false"/>
+          <w:color w:val="000000"/>
+          <w:sz w:val="24"/>
+          <w:szCs w:val="24"/>
+          <w:rFonts w:ascii="Times New Roman" w:cs="Times New Roman" w:eastAsia="Times New Roman" w:hAnsi="Times New Roman"/>
+        </w:rPr>
+        <w:t xml:space="preserve">• au sud-est, les </w:t>
+      </w:r>
+      <w:r>
+        <w:rPr>
+          <w:b/>
+          <w:bCs/>
+          <w:i w:val="false"/>
+          <w:iCs w:val="false"/>
+          <w:color w:val="1F4E79"/>
+          <w:sz w:val="24"/>
+          <w:szCs w:val="24"/>
+          <w:rFonts w:ascii="Times New Roman" w:cs="Times New Roman" w:eastAsia="Times New Roman" w:hAnsi="Times New Roman"/>
+        </w:rPr>
+        <w:t xml:space="preserve">Antemoro</w:t>
+      </w:r>
+      <w:r>
+        <w:rPr>
+          <w:b w:val="false"/>
+          <w:bCs w:val="false"/>
+          <w:i w:val="false"/>
+          <w:iCs w:val="false"/>
+          <w:color w:val="000000"/>
+          <w:sz w:val="24"/>
+          <w:szCs w:val="24"/>
+          <w:rFonts w:ascii="Times New Roman" w:cs="Times New Roman" w:eastAsia="Times New Roman" w:hAnsi="Times New Roman"/>
+        </w:rPr>
+        <w:t xml:space="preserve"> — héritiers d’ancêtres venus par l’océan Indien et détenteurs des </w:t>
+      </w:r>
+      <w:r>
+        <w:rPr>
+          <w:b/>
+          <w:bCs/>
+          <w:i w:val="false"/>
+          <w:iCs w:val="false"/>
+          <w:color w:val="1F4E79"/>
+          <w:sz w:val="24"/>
+          <w:szCs w:val="24"/>
+          <w:rFonts w:ascii="Times New Roman" w:cs="Times New Roman" w:eastAsia="Times New Roman" w:hAnsi="Times New Roman"/>
+        </w:rPr>
+        <w:t xml:space="preserve">sorabe</w:t>
+      </w:r>
+      <w:r>
+        <w:rPr>
+          <w:b w:val="false"/>
+          <w:bCs w:val="false"/>
+          <w:i w:val="false"/>
+          <w:iCs w:val="false"/>
+          <w:color w:val="000000"/>
+          <w:sz w:val="24"/>
+          <w:szCs w:val="24"/>
+          <w:rFonts w:ascii="Times New Roman" w:cs="Times New Roman" w:eastAsia="Times New Roman" w:hAnsi="Times New Roman"/>
+        </w:rPr>
+        <w:t xml:space="preserve">, manuscrits en caractères arabes — et les Antanosy ;</w:t>
+      </w:r>
+    </w:p>
+    <w:p>
+      <w:pPr>
+        <w:spacing w:after="60" w:line="300"/>
+        <w:jc w:val="both"/>
+      </w:pPr>
+      <w:r>
+        <w:rPr>
+          <w:b w:val="false"/>
+          <w:bCs w:val="false"/>
+          <w:i w:val="false"/>
+          <w:iCs w:val="false"/>
+          <w:color w:val="000000"/>
+          <w:sz w:val="24"/>
+          <w:szCs w:val="24"/>
+          <w:rFonts w:ascii="Times New Roman" w:cs="Times New Roman" w:eastAsia="Times New Roman" w:hAnsi="Times New Roman"/>
+        </w:rPr>
+        <w:t xml:space="preserve">• sur la côte est, les </w:t>
+      </w:r>
+      <w:r>
+        <w:rPr>
+          <w:b/>
+          <w:bCs/>
+          <w:i w:val="false"/>
+          <w:iCs w:val="false"/>
+          <w:color w:val="1F4E79"/>
+          <w:sz w:val="24"/>
+          <w:szCs w:val="24"/>
+          <w:rFonts w:ascii="Times New Roman" w:cs="Times New Roman" w:eastAsia="Times New Roman" w:hAnsi="Times New Roman"/>
+        </w:rPr>
+        <w:t xml:space="preserve">Betsimisaraka</w:t>
+      </w:r>
+      <w:r>
+        <w:rPr>
+          <w:b w:val="false"/>
+          <w:bCs w:val="false"/>
+          <w:i w:val="false"/>
+          <w:iCs w:val="false"/>
+          <w:color w:val="000000"/>
+          <w:sz w:val="24"/>
+          <w:szCs w:val="24"/>
+          <w:rFonts w:ascii="Times New Roman" w:cs="Times New Roman" w:eastAsia="Times New Roman" w:hAnsi="Times New Roman"/>
+        </w:rPr>
+        <w:t xml:space="preserve"> forment au XVIIIᵉ siècle une confédération qui unifie les peuples du littoral ;</w:t>
+      </w:r>
+    </w:p>
+    <w:p>
+      <w:pPr>
+        <w:spacing w:after="60" w:line="300"/>
+        <w:jc w:val="both"/>
+      </w:pPr>
+      <w:r>
+        <w:rPr>
+          <w:b w:val="false"/>
+          <w:bCs w:val="false"/>
+          <w:i w:val="false"/>
+          <w:iCs w:val="false"/>
+          <w:color w:val="000000"/>
+          <w:sz w:val="24"/>
+          <w:szCs w:val="24"/>
+          <w:rFonts w:ascii="Times New Roman" w:cs="Times New Roman" w:eastAsia="Times New Roman" w:hAnsi="Times New Roman"/>
+        </w:rPr>
+        <w:t xml:space="preserve">• sur les Hautes Terres centrales, le </w:t>
+      </w:r>
+      <w:r>
+        <w:rPr>
+          <w:b/>
+          <w:bCs/>
+          <w:i w:val="false"/>
+          <w:iCs w:val="false"/>
+          <w:color w:val="1F4E79"/>
+          <w:sz w:val="24"/>
+          <w:szCs w:val="24"/>
+          <w:rFonts w:ascii="Times New Roman" w:cs="Times New Roman" w:eastAsia="Times New Roman" w:hAnsi="Times New Roman"/>
+        </w:rPr>
+        <w:t xml:space="preserve">Betsileo</w:t>
+      </w:r>
+      <w:r>
+        <w:rPr>
+          <w:b w:val="false"/>
+          <w:bCs w:val="false"/>
+          <w:i w:val="false"/>
+          <w:iCs w:val="false"/>
+          <w:color w:val="000000"/>
+          <w:sz w:val="24"/>
+          <w:szCs w:val="24"/>
+          <w:rFonts w:ascii="Times New Roman" w:cs="Times New Roman" w:eastAsia="Times New Roman" w:hAnsi="Times New Roman"/>
+        </w:rPr>
+        <w:t xml:space="preserve"> au sud et l’</w:t>
+      </w:r>
+      <w:r>
+        <w:rPr>
+          <w:b/>
+          <w:bCs/>
+          <w:i w:val="false"/>
+          <w:iCs w:val="false"/>
+          <w:color w:val="1F4E79"/>
+          <w:sz w:val="24"/>
+          <w:szCs w:val="24"/>
+          <w:rFonts w:ascii="Times New Roman" w:cs="Times New Roman" w:eastAsia="Times New Roman" w:hAnsi="Times New Roman"/>
+        </w:rPr>
+        <w:t xml:space="preserve">Imerina</w:t>
+      </w:r>
+      <w:r>
+        <w:rPr>
+          <w:b w:val="false"/>
+          <w:bCs w:val="false"/>
+          <w:i w:val="false"/>
+          <w:iCs w:val="false"/>
+          <w:color w:val="000000"/>
+          <w:sz w:val="24"/>
+          <w:szCs w:val="24"/>
+          <w:rFonts w:ascii="Times New Roman" w:cs="Times New Roman" w:eastAsia="Times New Roman" w:hAnsi="Times New Roman"/>
+        </w:rPr>
+        <w:t xml:space="preserve"> au nord, autour d’Antananarivo.</w:t>
+      </w:r>
+    </w:p>
+    <w:p>
+      <w:pPr>
+        <w:spacing w:after="80" w:line="300"/>
+        <w:jc w:val="both"/>
+      </w:pPr>
+      <w:r>
+        <w:rPr>
+          <w:b/>
+          <w:bCs/>
+          <w:i w:val="false"/>
+          <w:iCs w:val="false"/>
+          <w:color w:val="2E7D32"/>
+          <w:sz w:val="26"/>
+          <w:szCs w:val="26"/>
+          <w:rFonts w:ascii="Times New Roman" w:cs="Times New Roman" w:eastAsia="Times New Roman" w:hAnsi="Times New Roman"/>
+        </w:rPr>
+        <w:t xml:space="preserve">3. Deux dynasties dominent la mémoire</w:t>
+      </w:r>
+    </w:p>
+    <w:p>
+      <w:pPr>
+        <w:spacing w:after="100" w:line="300"/>
+        <w:jc w:val="both"/>
+      </w:pPr>
+      <w:r>
+        <w:rPr>
+          <w:b w:val="false"/>
+          <w:bCs w:val="false"/>
+          <w:i w:val="false"/>
+          <w:iCs w:val="false"/>
+          <w:color w:val="000000"/>
+          <w:sz w:val="24"/>
+          <w:szCs w:val="24"/>
+          <w:rFonts w:ascii="Times New Roman" w:cs="Times New Roman" w:eastAsia="Times New Roman" w:hAnsi="Times New Roman"/>
+        </w:rPr>
+        <w:t xml:space="preserve">Une </w:t>
+      </w:r>
+      <w:r>
+        <w:rPr>
+          <w:b/>
+          <w:bCs/>
+          <w:i w:val="false"/>
+          <w:iCs w:val="false"/>
+          <w:color w:val="1F4E79"/>
+          <w:sz w:val="24"/>
+          <w:szCs w:val="24"/>
+          <w:rFonts w:ascii="Times New Roman" w:cs="Times New Roman" w:eastAsia="Times New Roman" w:hAnsi="Times New Roman"/>
+        </w:rPr>
+        <w:t xml:space="preserve">dynastie</w:t>
+      </w:r>
+      <w:r>
+        <w:rPr>
+          <w:b w:val="false"/>
+          <w:bCs w:val="false"/>
+          <w:i w:val="false"/>
+          <w:iCs w:val="false"/>
+          <w:color w:val="000000"/>
+          <w:sz w:val="24"/>
+          <w:szCs w:val="24"/>
+          <w:rFonts w:ascii="Times New Roman" w:cs="Times New Roman" w:eastAsia="Times New Roman" w:hAnsi="Times New Roman"/>
+        </w:rPr>
+        <w:t xml:space="preserve"> est une famille régnante qui se transmet le pouvoir. Deux d’entre elles dominent la mémoire historique : celle du Nord-Ouest </w:t>
+      </w:r>
+      <w:r>
+        <w:rPr>
+          <w:b/>
+          <w:bCs/>
+          <w:i w:val="false"/>
+          <w:iCs w:val="false"/>
+          <w:color w:val="1F4E79"/>
+          <w:sz w:val="24"/>
+          <w:szCs w:val="24"/>
+          <w:rFonts w:ascii="Times New Roman" w:cs="Times New Roman" w:eastAsia="Times New Roman" w:hAnsi="Times New Roman"/>
+        </w:rPr>
+        <w:t xml:space="preserve">sakalava</w:t>
+      </w:r>
+      <w:r>
+        <w:rPr>
+          <w:b w:val="false"/>
+          <w:bCs w:val="false"/>
+          <w:i w:val="false"/>
+          <w:iCs w:val="false"/>
+          <w:color w:val="000000"/>
+          <w:sz w:val="24"/>
+          <w:szCs w:val="24"/>
+          <w:rFonts w:ascii="Times New Roman" w:cs="Times New Roman" w:eastAsia="Times New Roman" w:hAnsi="Times New Roman"/>
+        </w:rPr>
+        <w:t xml:space="preserve"> et celle de l’</w:t>
+      </w:r>
+      <w:r>
+        <w:rPr>
+          <w:b/>
+          <w:bCs/>
+          <w:i w:val="false"/>
+          <w:iCs w:val="false"/>
+          <w:color w:val="1F4E79"/>
+          <w:sz w:val="24"/>
+          <w:szCs w:val="24"/>
+          <w:rFonts w:ascii="Times New Roman" w:cs="Times New Roman" w:eastAsia="Times New Roman" w:hAnsi="Times New Roman"/>
+        </w:rPr>
+        <w:t xml:space="preserve">Imerina</w:t>
+      </w:r>
+      <w:r>
+        <w:rPr>
+          <w:b w:val="false"/>
+          <w:bCs w:val="false"/>
+          <w:i w:val="false"/>
+          <w:iCs w:val="false"/>
+          <w:color w:val="000000"/>
+          <w:sz w:val="24"/>
+          <w:szCs w:val="24"/>
+          <w:rFonts w:ascii="Times New Roman" w:cs="Times New Roman" w:eastAsia="Times New Roman" w:hAnsi="Times New Roman"/>
+        </w:rPr>
+        <w:t xml:space="preserve"> — cette dernière, à la fin du XVIIIᵉ siècle, unifiera son territoire, puis étendra au XIXᵉ son autorité sur la majeure partie de l’île.</w:t>
+      </w:r>
+    </w:p>
+    <w:p>
+      <w:pPr>
+        <w:spacing w:after="100" w:line="300"/>
+        <w:jc w:val="both"/>
+      </w:pPr>
+      <w:r>
+        <w:rPr>
+          <w:b w:val="false"/>
+          <w:bCs w:val="false"/>
+          <w:i w:val="false"/>
+          <w:iCs w:val="false"/>
+          <w:color w:val="000000"/>
+          <w:sz w:val="24"/>
+          <w:szCs w:val="24"/>
+          <w:rFonts w:ascii="Times New Roman" w:cs="Times New Roman" w:eastAsia="Times New Roman" w:hAnsi="Times New Roman"/>
+        </w:rPr>
+        <w:t xml:space="preserve">Retiens la logique de la carte : chaque région naturelle porte un royaume — mais les frontières, elles, bougeaient sans cesse au gré des alliances, des mariages et des expéditions.</w:t>
       </w:r>
     </w:p>
     <w:p>
@@ -2875,8 +3448,331 @@
     </w:p>
     <w:p>
       <w:pPr>
-        <w:spacing w:before="200" w:after="150"/>
-        <w:jc w:val="left"/>
+        <w:spacing w:after="120"/>
+      </w:pPr>
+    </w:p>
+    <w:tbl>
+      <w:tblPr>
+        <w:tblW w:type="dxa" w:w="9600"/>
+        <w:tblBorders>
+          <w:top w:val="single" w:color="B25000" w:sz="12"/>
+          <w:left w:val="single" w:color="B25000" w:sz="12"/>
+          <w:bottom w:val="single" w:color="B25000" w:sz="12"/>
+          <w:right w:val="single" w:color="B25000" w:sz="12"/>
+          <w:insideH w:val="none"/>
+          <w:insideV w:val="none"/>
+        </w:tblBorders>
+        <w:tblLayout w:type="fixed"/>
+      </w:tblPr>
+      <w:tblGrid>
+        <w:gridCol w:w="9600"/>
+      </w:tblGrid>
+      <w:tr>
+        <w:tc>
+          <w:tcPr>
+            <w:shd w:fill="FFF8EF" w:val="clear"/>
+            <w:tcMar>
+              <w:top w:type="dxa" w:w="140"/>
+              <w:left w:type="dxa" w:w="180"/>
+              <w:bottom w:type="dxa" w:w="140"/>
+              <w:right w:type="dxa" w:w="180"/>
+            </w:tcMar>
+          </w:tcPr>
+          <w:p>
+            <w:pPr>
+              <w:spacing w:after="90"/>
+            </w:pPr>
+            <w:r>
+              <w:rPr>
+                <w:b/>
+                <w:bCs/>
+                <w:i w:val="false"/>
+                <w:iCs w:val="false"/>
+                <w:color w:val="B25000"/>
+                <w:sz w:val="25"/>
+                <w:szCs w:val="25"/>
+                <w:rFonts w:ascii="Times New Roman" w:cs="Times New Roman" w:eastAsia="Times New Roman" w:hAnsi="Times New Roman"/>
+              </w:rPr>
+              <w:t xml:space="preserve">Document à étudier</w:t>
+            </w:r>
+          </w:p>
+          <w:p>
+            <w:pPr>
+              <w:spacing w:after="80" w:line="300"/>
+              <w:jc w:val="left"/>
+            </w:pPr>
+            <w:r>
+              <w:rPr>
+                <w:b/>
+                <w:bCs/>
+                <w:i w:val="false"/>
+                <w:iCs w:val="false"/>
+                <w:color w:val="000000"/>
+                <w:sz w:val="21"/>
+                <w:szCs w:val="21"/>
+                <w:rFonts w:ascii="Times New Roman" w:cs="Times New Roman" w:eastAsia="Times New Roman" w:hAnsi="Times New Roman"/>
+              </w:rPr>
+              <w:t xml:space="preserve">Un voyageur traverse l’île jusqu’en Imerina — d’après Nicolas Mayeur, Voyage au pays d’Ancove (1777) — extrait adapté</w:t>
+            </w:r>
+          </w:p>
+          <w:p>
+            <w:pPr>
+              <w:spacing w:after="100" w:line="300"/>
+              <w:jc w:val="both"/>
+            </w:pPr>
+            <w:r>
+              <w:rPr>
+                <w:b w:val="false"/>
+                <w:bCs w:val="false"/>
+                <w:i/>
+                <w:iCs/>
+                <w:color w:val="000000"/>
+                <w:sz w:val="24"/>
+                <w:szCs w:val="24"/>
+                <w:rFonts w:ascii="Times New Roman" w:cs="Times New Roman" w:eastAsia="Times New Roman" w:hAnsi="Times New Roman"/>
+              </w:rPr>
+              <w:t xml:space="preserve">« Parti de la côte orientale, je traversai d’abord le pays des Betsimisaraka, dont les villages bordent les lagunes et les forêts. Après plusieurs jours de marche dans la grande forêt et la montée des falaises, j’atteignis les hauteurs : un pays découvert, frais, couvert de rizières en étages et de villages fortifiés sur les collines. Ce pays, que les gens de la côte nomment Ancove, est gouverné par plusieurs chefs qui se font la guerre ; mais il est si peuplé et si bien cultivé qu’il surpasse en industrie tout ce que j’ai vu sur cette île. On y tisse, on y forge, on y commerce avec un art étonnant. »</w:t>
+            </w:r>
+          </w:p>
+          <w:p>
+            <w:pPr>
+              <w:spacing w:after="40" w:line="300"/>
+              <w:jc w:val="both"/>
+            </w:pPr>
+            <w:r>
+              <w:rPr>
+                <w:b w:val="false"/>
+                <w:bCs w:val="false"/>
+                <w:i w:val="false"/>
+                <w:iCs w:val="false"/>
+                <w:color w:val="000000"/>
+                <w:sz w:val="24"/>
+                <w:szCs w:val="24"/>
+                <w:rFonts w:ascii="Times New Roman" w:cs="Times New Roman" w:eastAsia="Times New Roman" w:hAnsi="Times New Roman"/>
+              </w:rPr>
+              <w:t xml:space="preserve">1. Quelles régions et quels royaumes le voyageur traverse-t-il successivement ?</w:t>
+            </w:r>
+          </w:p>
+          <w:p>
+            <w:pPr>
+              <w:spacing w:after="40" w:line="300"/>
+              <w:jc w:val="both"/>
+            </w:pPr>
+            <w:r>
+              <w:rPr>
+                <w:b w:val="false"/>
+                <w:bCs w:val="false"/>
+                <w:i w:val="false"/>
+                <w:iCs w:val="false"/>
+                <w:color w:val="000000"/>
+                <w:sz w:val="24"/>
+                <w:szCs w:val="24"/>
+                <w:rFonts w:ascii="Times New Roman" w:cs="Times New Roman" w:eastAsia="Times New Roman" w:hAnsi="Times New Roman"/>
+              </w:rPr>
+              <w:t xml:space="preserve">2. Relève les obstacles naturels qui séparent la côte des Hautes Terres.</w:t>
+            </w:r>
+          </w:p>
+          <w:p>
+            <w:pPr>
+              <w:spacing w:after="40" w:line="300"/>
+              <w:jc w:val="both"/>
+            </w:pPr>
+            <w:r>
+              <w:rPr>
+                <w:b w:val="false"/>
+                <w:bCs w:val="false"/>
+                <w:i w:val="false"/>
+                <w:iCs w:val="false"/>
+                <w:color w:val="000000"/>
+                <w:sz w:val="24"/>
+                <w:szCs w:val="24"/>
+                <w:rFonts w:ascii="Times New Roman" w:cs="Times New Roman" w:eastAsia="Times New Roman" w:hAnsi="Times New Roman"/>
+              </w:rPr>
+              <w:t xml:space="preserve">3. Que nous apprend ce témoignage sur l’Imerina avant son unification ?</w:t>
+            </w:r>
+          </w:p>
+          <w:p>
+            <w:pPr>
+              <w:spacing w:after="60"/>
+            </w:pPr>
+          </w:p>
+          <w:p>
+            <w:pPr>
+              <w:spacing w:after="40"/>
+            </w:pPr>
+            <w:r>
+              <w:rPr>
+                <w:b/>
+                <w:bCs/>
+                <w:i w:val="false"/>
+                <w:iCs w:val="false"/>
+                <w:color w:val="C2185B"/>
+                <w:sz w:val="22"/>
+                <w:szCs w:val="22"/>
+                <w:rFonts w:ascii="Times New Roman" w:cs="Times New Roman" w:eastAsia="Times New Roman" w:hAnsi="Times New Roman"/>
+              </w:rPr>
+              <w:t xml:space="preserve">Réponse 1. </w:t>
+            </w:r>
+            <w:r>
+              <w:rPr>
+                <w:b w:val="false"/>
+                <w:bCs w:val="false"/>
+                <w:i w:val="false"/>
+                <w:iCs w:val="false"/>
+                <w:color w:val="000000"/>
+                <w:sz w:val="22"/>
+                <w:szCs w:val="22"/>
+                <w:rFonts w:ascii="Times New Roman" w:cs="Times New Roman" w:eastAsia="Times New Roman" w:hAnsi="Times New Roman"/>
+              </w:rPr>
+              <w:t xml:space="preserve">La côte est des Betsimisaraka, puis la grande forêt et les falaises, enfin les Hautes Terres de l’« Ancove » — c’est-à-dire l’Imerina.</w:t>
+            </w:r>
+          </w:p>
+          <w:p>
+            <w:pPr>
+              <w:spacing w:after="40"/>
+            </w:pPr>
+            <w:r>
+              <w:rPr>
+                <w:b/>
+                <w:bCs/>
+                <w:i w:val="false"/>
+                <w:iCs w:val="false"/>
+                <w:color w:val="C2185B"/>
+                <w:sz w:val="22"/>
+                <w:szCs w:val="22"/>
+                <w:rFonts w:ascii="Times New Roman" w:cs="Times New Roman" w:eastAsia="Times New Roman" w:hAnsi="Times New Roman"/>
+              </w:rPr>
+              <w:t xml:space="preserve">Réponse 2. </w:t>
+            </w:r>
+            <w:r>
+              <w:rPr>
+                <w:b w:val="false"/>
+                <w:bCs w:val="false"/>
+                <w:i w:val="false"/>
+                <w:iCs w:val="false"/>
+                <w:color w:val="000000"/>
+                <w:sz w:val="22"/>
+                <w:szCs w:val="22"/>
+                <w:rFonts w:ascii="Times New Roman" w:cs="Times New Roman" w:eastAsia="Times New Roman" w:hAnsi="Times New Roman"/>
+              </w:rPr>
+              <w:t xml:space="preserve">La grande forêt orientale et la montée des falaises (l’escarpement) : ce cloisonnement explique que les royaumes se soient développés séparément.</w:t>
+            </w:r>
+          </w:p>
+          <w:p>
+            <w:pPr>
+              <w:spacing w:after="40"/>
+            </w:pPr>
+            <w:r>
+              <w:rPr>
+                <w:b/>
+                <w:bCs/>
+                <w:i w:val="false"/>
+                <w:iCs w:val="false"/>
+                <w:color w:val="C2185B"/>
+                <w:sz w:val="22"/>
+                <w:szCs w:val="22"/>
+                <w:rFonts w:ascii="Times New Roman" w:cs="Times New Roman" w:eastAsia="Times New Roman" w:hAnsi="Times New Roman"/>
+              </w:rPr>
+              <w:t xml:space="preserve">Réponse 3. </w:t>
+            </w:r>
+            <w:r>
+              <w:rPr>
+                <w:b w:val="false"/>
+                <w:bCs w:val="false"/>
+                <w:i w:val="false"/>
+                <w:iCs w:val="false"/>
+                <w:color w:val="000000"/>
+                <w:sz w:val="22"/>
+                <w:szCs w:val="22"/>
+                <w:rFonts w:ascii="Times New Roman" w:cs="Times New Roman" w:eastAsia="Times New Roman" w:hAnsi="Times New Roman"/>
+              </w:rPr>
+              <w:t xml:space="preserve">Que l’Imerina est encore divisé entre plusieurs chefs rivaux (l’unification viendra à la fin du XVIIIᵉ siècle), mais déjà très peuplé, cultivé et actif — tissage, forge, commerce.</w:t>
+            </w:r>
+          </w:p>
+        </w:tc>
+      </w:tr>
+    </w:tbl>
+    <w:p>
+      <w:pPr>
+        <w:spacing w:after="160"/>
+      </w:pPr>
+    </w:p>
+    <w:tbl>
+      <w:tblPr>
+        <w:tblW w:type="dxa" w:w="9600"/>
+        <w:tblBorders>
+          <w:top w:val="single" w:color="1565C0" w:sz="12"/>
+          <w:left w:val="single" w:color="1565C0" w:sz="12"/>
+          <w:bottom w:val="single" w:color="1565C0" w:sz="12"/>
+          <w:right w:val="single" w:color="1565C0" w:sz="12"/>
+          <w:insideH w:val="none"/>
+          <w:insideV w:val="none"/>
+        </w:tblBorders>
+        <w:tblLayout w:type="fixed"/>
+      </w:tblPr>
+      <w:tblGrid>
+        <w:gridCol w:w="9600"/>
+      </w:tblGrid>
+      <w:tr>
+        <w:tc>
+          <w:tcPr>
+            <w:shd w:fill="E3F2FD" w:val="clear"/>
+            <w:tcMar>
+              <w:top w:type="dxa" w:w="140"/>
+              <w:left w:type="dxa" w:w="180"/>
+              <w:bottom w:type="dxa" w:w="140"/>
+              <w:right w:type="dxa" w:w="180"/>
+            </w:tcMar>
+          </w:tcPr>
+          <w:p>
+            <w:pPr>
+              <w:spacing w:after="90"/>
+            </w:pPr>
+            <w:r>
+              <w:rPr>
+                <w:b/>
+                <w:bCs/>
+                <w:i w:val="false"/>
+                <w:iCs w:val="false"/>
+                <w:color w:val="1565C0"/>
+                <w:sz w:val="25"/>
+                <w:szCs w:val="25"/>
+                <w:rFonts w:ascii="Times New Roman" w:cs="Times New Roman" w:eastAsia="Times New Roman" w:hAnsi="Times New Roman"/>
+              </w:rPr>
+              <w:t xml:space="preserve">Le savais-tu ?</w:t>
+            </w:r>
+          </w:p>
+          <w:p>
+            <w:pPr>
+              <w:spacing w:after="0" w:line="300"/>
+              <w:jc w:val="both"/>
+            </w:pPr>
+            <w:r>
+              <w:rPr>
+                <w:b w:val="false"/>
+                <w:bCs w:val="false"/>
+                <w:i w:val="false"/>
+                <w:iCs w:val="false"/>
+                <w:color w:val="000000"/>
+                <w:sz w:val="22"/>
+                <w:szCs w:val="22"/>
+                <w:rFonts w:ascii="Times New Roman" w:cs="Times New Roman" w:eastAsia="Times New Roman" w:hAnsi="Times New Roman"/>
+              </w:rPr>
+              <w:t xml:space="preserve">Les noms des royaumes racontent leur histoire ! « Betsimisaraka » signifie « les nombreux qui ne se séparent pas » — le nom même de la confédération fondée vers 1712 par Ratsimilaho sur la côte est. « Menabe » veut dire « le grand rouge », et « Imerina », selon la tradition, « le pays d’où l’on voit loin » — tout un programme pour un royaume des hauteurs !</w:t>
+            </w:r>
+          </w:p>
+        </w:tc>
+      </w:tr>
+    </w:tbl>
+    <w:p>
+      <w:pPr>
+        <w:spacing w:after="160"/>
+      </w:pPr>
+    </w:p>
+    <w:p>
+      <w:pPr>
+        <w:spacing w:after="80" w:line="300"/>
+        <w:jc w:val="both"/>
       </w:pPr>
       <w:r>
         <w:rPr>
@@ -2885,166 +3781,337 @@
           <w:i w:val="false"/>
           <w:iCs w:val="false"/>
           <w:color w:val="2E7D32"/>
-          <w:sz w:val="28"/>
-          <w:szCs w:val="28"/>
-          <w:rFonts w:ascii="Times New Roman" w:cs="Times New Roman" w:eastAsia="Times New Roman" w:hAnsi="Times New Roman"/>
-        </w:rPr>
-        <w:t xml:space="preserve">Méthode</w:t>
-      </w:r>
-    </w:p>
-    <w:p>
-      <w:pPr>
-        <w:spacing w:after="60" w:line="300"/>
-        <w:jc w:val="both"/>
-      </w:pPr>
-      <w:r>
-        <w:rPr>
-          <w:b w:val="false"/>
-          <w:bCs w:val="false"/>
-          <w:i w:val="false"/>
-          <w:iCs w:val="false"/>
-          <w:color w:val="000000"/>
-          <w:sz w:val="24"/>
-          <w:szCs w:val="24"/>
-          <w:rFonts w:ascii="Times New Roman" w:cs="Times New Roman" w:eastAsia="Times New Roman" w:hAnsi="Times New Roman"/>
-        </w:rPr>
-        <w:t xml:space="preserve">1. Dessiner la carte de l’île et placer chaque royaume dans sa région.</w:t>
-      </w:r>
-    </w:p>
-    <w:p>
-      <w:pPr>
-        <w:spacing w:after="60" w:line="300"/>
-        <w:jc w:val="both"/>
-      </w:pPr>
-      <w:r>
-        <w:rPr>
-          <w:b w:val="false"/>
-          <w:bCs w:val="false"/>
-          <w:i w:val="false"/>
-          <w:iCs w:val="false"/>
-          <w:color w:val="000000"/>
-          <w:sz w:val="24"/>
-          <w:szCs w:val="24"/>
-          <w:rFonts w:ascii="Times New Roman" w:cs="Times New Roman" w:eastAsia="Times New Roman" w:hAnsi="Times New Roman"/>
-        </w:rPr>
-        <w:t xml:space="preserve">2. Associer chaque région à un milieu naturel (côtes, pâturages, Hautes Terres).</w:t>
-      </w:r>
-    </w:p>
-    <w:p>
-      <w:pPr>
-        <w:spacing w:after="60" w:line="300"/>
-        <w:jc w:val="both"/>
-      </w:pPr>
-      <w:r>
-        <w:rPr>
-          <w:b w:val="false"/>
-          <w:bCs w:val="false"/>
-          <w:i w:val="false"/>
-          <w:iCs w:val="false"/>
-          <w:color w:val="000000"/>
-          <w:sz w:val="24"/>
-          <w:szCs w:val="24"/>
-          <w:rFonts w:ascii="Times New Roman" w:cs="Times New Roman" w:eastAsia="Times New Roman" w:hAnsi="Times New Roman"/>
-        </w:rPr>
-        <w:t xml:space="preserve">3. Retenir les deux dynasties majeures : sakalava du Nord-Ouest et merina de l’Imerina.</w:t>
-      </w:r>
-    </w:p>
-    <w:p>
-      <w:pPr>
-        <w:spacing w:after="110" w:line="300"/>
-        <w:jc w:val="both"/>
-      </w:pPr>
-      <w:r>
-        <w:rPr>
-          <w:b/>
-          <w:bCs/>
-          <w:i w:val="false"/>
-          <w:iCs w:val="false"/>
-          <w:color w:val="1F4E79"/>
-          <w:sz w:val="24"/>
-          <w:szCs w:val="24"/>
-          <w:rFonts w:ascii="Times New Roman" w:cs="Times New Roman" w:eastAsia="Times New Roman" w:hAnsi="Times New Roman"/>
-        </w:rPr>
-        <w:t xml:space="preserve">Exemple — </w:t>
-      </w:r>
-      <w:r>
-        <w:rPr>
-          <w:b w:val="false"/>
-          <w:bCs w:val="false"/>
-          <w:i w:val="false"/>
-          <w:iCs w:val="false"/>
-          <w:color w:val="000000"/>
-          <w:sz w:val="24"/>
-          <w:szCs w:val="24"/>
-          <w:rFonts w:ascii="Times New Roman" w:cs="Times New Roman" w:eastAsia="Times New Roman" w:hAnsi="Times New Roman"/>
-        </w:rPr>
-        <w:t xml:space="preserve">Sur une carte muette, place : Antakarana tout au nord, Boina au nord-ouest, Menabe à l’ouest, Mahafaly et Androy au sud, Antemoro au sud-est, Betsimisaraka à l’est, Imerina au centre — tu viens de reconstituer la carte politique de l’île avant le XIXᵉ siècle.</w:t>
-      </w:r>
-    </w:p>
-    <w:p>
-      <w:pPr>
-        <w:spacing w:after="110" w:line="300"/>
-        <w:jc w:val="both"/>
-      </w:pPr>
-      <w:r>
-        <w:rPr>
-          <w:b/>
-          <w:bCs/>
-          <w:i w:val="false"/>
-          <w:iCs w:val="false"/>
-          <w:color w:val="B25000"/>
-          <w:sz w:val="24"/>
-          <w:szCs w:val="24"/>
-          <w:rFonts w:ascii="Times New Roman" w:cs="Times New Roman" w:eastAsia="Times New Roman" w:hAnsi="Times New Roman"/>
-        </w:rPr>
-        <w:t xml:space="preserve">Erreur à éviter — </w:t>
-      </w:r>
-      <w:r>
-        <w:rPr>
-          <w:b w:val="false"/>
-          <w:bCs w:val="false"/>
-          <w:i w:val="false"/>
-          <w:iCs w:val="false"/>
-          <w:color w:val="000000"/>
-          <w:sz w:val="24"/>
-          <w:szCs w:val="24"/>
-          <w:rFonts w:ascii="Times New Roman" w:cs="Times New Roman" w:eastAsia="Times New Roman" w:hAnsi="Times New Roman"/>
-        </w:rPr>
-        <w:t xml:space="preserve">Croire que « royaume » signifie « frontières fixes » comme aujourd’hui : les royaumes malgaches sont des espaces mouvants, qui s’étendent ou se réduisent au gré des alliances, des mariages et des expéditions. La carte des royaumes est une photographie — la réalité bougeait sans cesse.</w:t>
-      </w:r>
-    </w:p>
-    <w:p>
-      <w:pPr>
-        <w:shd w:fill="E3F2FD" w:val="clear"/>
-        <w:spacing w:after="110" w:line="300"/>
-        <w:jc w:val="both"/>
-      </w:pPr>
-      <w:r>
-        <w:rPr>
-          <w:b/>
-          <w:bCs/>
-          <w:i w:val="false"/>
-          <w:iCs w:val="false"/>
-          <w:color w:val="1565C0"/>
-          <w:sz w:val="24"/>
-          <w:szCs w:val="24"/>
-          <w:rFonts w:ascii="Times New Roman" w:cs="Times New Roman" w:eastAsia="Times New Roman" w:hAnsi="Times New Roman"/>
-        </w:rPr>
-        <w:t xml:space="preserve">Le savais-tu ? </w:t>
-      </w:r>
-      <w:r>
-        <w:rPr>
-          <w:b w:val="false"/>
-          <w:bCs w:val="false"/>
-          <w:i w:val="false"/>
-          <w:iCs w:val="false"/>
-          <w:color w:val="000000"/>
-          <w:sz w:val="24"/>
-          <w:szCs w:val="24"/>
-          <w:rFonts w:ascii="Times New Roman" w:cs="Times New Roman" w:eastAsia="Times New Roman" w:hAnsi="Times New Roman"/>
-        </w:rPr>
-        <w:t xml:space="preserve">Les noms des royaumes racontent leur histoire ! « Betsimisaraka » signifie « les nombreux qui ne se séparent pas » — le nom même de la confédération fondée vers 1712 par Ratsimilaho sur la côte est. « Menabe » veut dire « le grand rouge », et « Imerina », selon la tradition, « le pays d’où l’on voit loin » — tout un programme pour un royaume des hauteurs !</w:t>
-      </w:r>
+          <w:sz w:val="26"/>
+          <w:szCs w:val="26"/>
+          <w:rFonts w:ascii="Times New Roman" w:cs="Times New Roman" w:eastAsia="Times New Roman" w:hAnsi="Times New Roman"/>
+        </w:rPr>
+        <w:t xml:space="preserve">Petit lexique</w:t>
+      </w:r>
+    </w:p>
+    <w:tbl>
+      <w:tblPr>
+        <w:tblW w:type="dxa" w:w="9600"/>
+        <w:tblBorders>
+          <w:top w:val="single" w:color="808080" w:sz="4"/>
+          <w:left w:val="single" w:color="808080" w:sz="4"/>
+          <w:bottom w:val="single" w:color="808080" w:sz="4"/>
+          <w:right w:val="single" w:color="808080" w:sz="4"/>
+          <w:insideH w:val="single" w:color="B0B0B0" w:sz="4"/>
+          <w:insideV w:val="single" w:color="B0B0B0" w:sz="4"/>
+        </w:tblBorders>
+        <w:tblLayout w:type="fixed"/>
+      </w:tblPr>
+      <w:tblGrid>
+        <w:gridCol w:w="2800"/>
+        <w:gridCol w:w="6800"/>
+      </w:tblGrid>
+      <w:tr>
+        <w:tc>
+          <w:tcPr>
+            <w:shd w:fill="E7E6E6" w:val="clear"/>
+            <w:tcMar>
+              <w:top w:type="dxa" w:w="80"/>
+              <w:left w:type="dxa" w:w="80"/>
+              <w:bottom w:type="dxa" w:w="80"/>
+              <w:right w:type="dxa" w:w="80"/>
+            </w:tcMar>
+          </w:tcPr>
+          <w:p>
+            <w:pPr>
+              <w:spacing w:after="40"/>
+              <w:jc w:val="left"/>
+            </w:pPr>
+            <w:r>
+              <w:rPr>
+                <w:b/>
+                <w:bCs/>
+                <w:i w:val="false"/>
+                <w:iCs w:val="false"/>
+                <w:color w:val="000000"/>
+                <w:sz w:val="20"/>
+                <w:szCs w:val="20"/>
+                <w:rFonts w:ascii="Times New Roman" w:cs="Times New Roman" w:eastAsia="Times New Roman" w:hAnsi="Times New Roman"/>
+              </w:rPr>
+              <w:t xml:space="preserve">Mot</w:t>
+            </w:r>
+          </w:p>
+        </w:tc>
+        <w:tc>
+          <w:tcPr>
+            <w:shd w:fill="E7E6E6" w:val="clear"/>
+            <w:tcMar>
+              <w:top w:type="dxa" w:w="80"/>
+              <w:left w:type="dxa" w:w="80"/>
+              <w:bottom w:type="dxa" w:w="80"/>
+              <w:right w:type="dxa" w:w="80"/>
+            </w:tcMar>
+          </w:tcPr>
+          <w:p>
+            <w:pPr>
+              <w:spacing w:after="40"/>
+              <w:jc w:val="left"/>
+            </w:pPr>
+            <w:r>
+              <w:rPr>
+                <w:b/>
+                <w:bCs/>
+                <w:i w:val="false"/>
+                <w:iCs w:val="false"/>
+                <w:color w:val="000000"/>
+                <w:sz w:val="20"/>
+                <w:szCs w:val="20"/>
+                <w:rFonts w:ascii="Times New Roman" w:cs="Times New Roman" w:eastAsia="Times New Roman" w:hAnsi="Times New Roman"/>
+              </w:rPr>
+              <w:t xml:space="preserve">Sens</w:t>
+            </w:r>
+          </w:p>
+        </w:tc>
+      </w:tr>
+      <w:tr>
+        <w:tc>
+          <w:tcPr>
+            <w:tcMar>
+              <w:top w:type="dxa" w:w="80"/>
+              <w:left w:type="dxa" w:w="80"/>
+              <w:bottom w:type="dxa" w:w="80"/>
+              <w:right w:type="dxa" w:w="80"/>
+            </w:tcMar>
+          </w:tcPr>
+          <w:p>
+            <w:pPr>
+              <w:spacing w:after="40"/>
+              <w:jc w:val="left"/>
+            </w:pPr>
+            <w:r>
+              <w:rPr>
+                <w:b/>
+                <w:bCs/>
+                <w:i w:val="false"/>
+                <w:iCs w:val="false"/>
+                <w:color w:val="000000"/>
+                <w:sz w:val="20"/>
+                <w:szCs w:val="20"/>
+                <w:rFonts w:ascii="Times New Roman" w:cs="Times New Roman" w:eastAsia="Times New Roman" w:hAnsi="Times New Roman"/>
+              </w:rPr>
+              <w:t xml:space="preserve">Dynastie</w:t>
+            </w:r>
+          </w:p>
+        </w:tc>
+        <w:tc>
+          <w:tcPr>
+            <w:tcMar>
+              <w:top w:type="dxa" w:w="80"/>
+              <w:left w:type="dxa" w:w="80"/>
+              <w:bottom w:type="dxa" w:w="80"/>
+              <w:right w:type="dxa" w:w="80"/>
+            </w:tcMar>
+          </w:tcPr>
+          <w:p>
+            <w:pPr>
+              <w:spacing w:after="40"/>
+              <w:jc w:val="left"/>
+            </w:pPr>
+            <w:r>
+              <w:rPr>
+                <w:b w:val="false"/>
+                <w:bCs w:val="false"/>
+                <w:i w:val="false"/>
+                <w:iCs w:val="false"/>
+                <w:color w:val="000000"/>
+                <w:sz w:val="20"/>
+                <w:szCs w:val="20"/>
+                <w:rFonts w:ascii="Times New Roman" w:cs="Times New Roman" w:eastAsia="Times New Roman" w:hAnsi="Times New Roman"/>
+              </w:rPr>
+              <w:t xml:space="preserve">famille régnante qui se transmet le pouvoir</w:t>
+            </w:r>
+          </w:p>
+        </w:tc>
+      </w:tr>
+      <w:tr>
+        <w:tc>
+          <w:tcPr>
+            <w:tcMar>
+              <w:top w:type="dxa" w:w="80"/>
+              <w:left w:type="dxa" w:w="80"/>
+              <w:bottom w:type="dxa" w:w="80"/>
+              <w:right w:type="dxa" w:w="80"/>
+            </w:tcMar>
+          </w:tcPr>
+          <w:p>
+            <w:pPr>
+              <w:spacing w:after="40"/>
+              <w:jc w:val="left"/>
+            </w:pPr>
+            <w:r>
+              <w:rPr>
+                <w:b/>
+                <w:bCs/>
+                <w:i w:val="false"/>
+                <w:iCs w:val="false"/>
+                <w:color w:val="000000"/>
+                <w:sz w:val="20"/>
+                <w:szCs w:val="20"/>
+                <w:rFonts w:ascii="Times New Roman" w:cs="Times New Roman" w:eastAsia="Times New Roman" w:hAnsi="Times New Roman"/>
+              </w:rPr>
+              <w:t xml:space="preserve">Confédération</w:t>
+            </w:r>
+          </w:p>
+        </w:tc>
+        <w:tc>
+          <w:tcPr>
+            <w:tcMar>
+              <w:top w:type="dxa" w:w="80"/>
+              <w:left w:type="dxa" w:w="80"/>
+              <w:bottom w:type="dxa" w:w="80"/>
+              <w:right w:type="dxa" w:w="80"/>
+            </w:tcMar>
+          </w:tcPr>
+          <w:p>
+            <w:pPr>
+              <w:spacing w:after="40"/>
+              <w:jc w:val="left"/>
+            </w:pPr>
+            <w:r>
+              <w:rPr>
+                <w:b w:val="false"/>
+                <w:bCs w:val="false"/>
+                <w:i w:val="false"/>
+                <w:iCs w:val="false"/>
+                <w:color w:val="000000"/>
+                <w:sz w:val="20"/>
+                <w:szCs w:val="20"/>
+                <w:rFonts w:ascii="Times New Roman" w:cs="Times New Roman" w:eastAsia="Times New Roman" w:hAnsi="Times New Roman"/>
+              </w:rPr>
+              <w:t xml:space="preserve">union de plusieurs peuples sous une même autorité</w:t>
+            </w:r>
+          </w:p>
+        </w:tc>
+      </w:tr>
+      <w:tr>
+        <w:tc>
+          <w:tcPr>
+            <w:tcMar>
+              <w:top w:type="dxa" w:w="80"/>
+              <w:left w:type="dxa" w:w="80"/>
+              <w:bottom w:type="dxa" w:w="80"/>
+              <w:right w:type="dxa" w:w="80"/>
+            </w:tcMar>
+          </w:tcPr>
+          <w:p>
+            <w:pPr>
+              <w:spacing w:after="40"/>
+              <w:jc w:val="left"/>
+            </w:pPr>
+            <w:r>
+              <w:rPr>
+                <w:b/>
+                <w:bCs/>
+                <w:i w:val="false"/>
+                <w:iCs w:val="false"/>
+                <w:color w:val="000000"/>
+                <w:sz w:val="20"/>
+                <w:szCs w:val="20"/>
+                <w:rFonts w:ascii="Times New Roman" w:cs="Times New Roman" w:eastAsia="Times New Roman" w:hAnsi="Times New Roman"/>
+              </w:rPr>
+              <w:t xml:space="preserve">Sorabe</w:t>
+            </w:r>
+          </w:p>
+        </w:tc>
+        <w:tc>
+          <w:tcPr>
+            <w:tcMar>
+              <w:top w:type="dxa" w:w="80"/>
+              <w:left w:type="dxa" w:w="80"/>
+              <w:bottom w:type="dxa" w:w="80"/>
+              <w:right w:type="dxa" w:w="80"/>
+            </w:tcMar>
+          </w:tcPr>
+          <w:p>
+            <w:pPr>
+              <w:spacing w:after="40"/>
+              <w:jc w:val="left"/>
+            </w:pPr>
+            <w:r>
+              <w:rPr>
+                <w:b w:val="false"/>
+                <w:bCs w:val="false"/>
+                <w:i w:val="false"/>
+                <w:iCs w:val="false"/>
+                <w:color w:val="000000"/>
+                <w:sz w:val="20"/>
+                <w:szCs w:val="20"/>
+                <w:rFonts w:ascii="Times New Roman" w:cs="Times New Roman" w:eastAsia="Times New Roman" w:hAnsi="Times New Roman"/>
+              </w:rPr>
+              <w:t xml:space="preserve">manuscrits antemoro écrits en caractères arabes</w:t>
+            </w:r>
+          </w:p>
+        </w:tc>
+      </w:tr>
+      <w:tr>
+        <w:tc>
+          <w:tcPr>
+            <w:tcMar>
+              <w:top w:type="dxa" w:w="80"/>
+              <w:left w:type="dxa" w:w="80"/>
+              <w:bottom w:type="dxa" w:w="80"/>
+              <w:right w:type="dxa" w:w="80"/>
+            </w:tcMar>
+          </w:tcPr>
+          <w:p>
+            <w:pPr>
+              <w:spacing w:after="40"/>
+              <w:jc w:val="left"/>
+            </w:pPr>
+            <w:r>
+              <w:rPr>
+                <w:b/>
+                <w:bCs/>
+                <w:i w:val="false"/>
+                <w:iCs w:val="false"/>
+                <w:color w:val="000000"/>
+                <w:sz w:val="20"/>
+                <w:szCs w:val="20"/>
+                <w:rFonts w:ascii="Times New Roman" w:cs="Times New Roman" w:eastAsia="Times New Roman" w:hAnsi="Times New Roman"/>
+              </w:rPr>
+              <w:t xml:space="preserve">Escarpement</w:t>
+            </w:r>
+          </w:p>
+        </w:tc>
+        <w:tc>
+          <w:tcPr>
+            <w:tcMar>
+              <w:top w:type="dxa" w:w="80"/>
+              <w:left w:type="dxa" w:w="80"/>
+              <w:bottom w:type="dxa" w:w="80"/>
+              <w:right w:type="dxa" w:w="80"/>
+            </w:tcMar>
+          </w:tcPr>
+          <w:p>
+            <w:pPr>
+              <w:spacing w:after="40"/>
+              <w:jc w:val="left"/>
+            </w:pPr>
+            <w:r>
+              <w:rPr>
+                <w:b w:val="false"/>
+                <w:bCs w:val="false"/>
+                <w:i w:val="false"/>
+                <w:iCs w:val="false"/>
+                <w:color w:val="000000"/>
+                <w:sz w:val="20"/>
+                <w:szCs w:val="20"/>
+                <w:rFonts w:ascii="Times New Roman" w:cs="Times New Roman" w:eastAsia="Times New Roman" w:hAnsi="Times New Roman"/>
+              </w:rPr>
+              <w:t xml:space="preserve">grande falaise séparant la côte est des Hautes Terres</w:t>
+            </w:r>
+          </w:p>
+        </w:tc>
+      </w:tr>
+    </w:tbl>
+    <w:p>
+      <w:pPr>
+        <w:spacing w:after="120"/>
+      </w:pPr>
     </w:p>
     <w:p>
       <w:pPr>
@@ -4708,152 +5775,152 @@
                 <w:szCs w:val="20"/>
                 <w:rFonts w:ascii="Times New Roman" w:cs="Times New Roman" w:eastAsia="Times New Roman" w:hAnsi="Times New Roman"/>
               </w:rPr>
-              <w:t xml:space="preserve">3. Observation</w:t>
-            </w:r>
-          </w:p>
-        </w:tc>
-        <w:tc>
-          <w:tcPr>
-            <w:tcMar>
-              <w:top w:type="dxa" w:w="80"/>
-              <w:left w:type="dxa" w:w="80"/>
-              <w:bottom w:type="dxa" w:w="80"/>
-              <w:right w:type="dxa" w:w="80"/>
-            </w:tcMar>
-          </w:tcPr>
-          <w:p>
-            <w:pPr>
-              <w:spacing w:after="40"/>
-              <w:jc w:val="left"/>
-            </w:pPr>
-            <w:r>
-              <w:rPr>
-                <w:b w:val="false"/>
-                <w:bCs w:val="false"/>
-                <w:i w:val="false"/>
-                <w:iCs w:val="false"/>
-                <w:color w:val="000000"/>
-                <w:sz w:val="20"/>
-                <w:szCs w:val="20"/>
-                <w:rFonts w:ascii="Times New Roman" w:cs="Times New Roman" w:eastAsia="Times New Roman" w:hAnsi="Times New Roman"/>
-              </w:rPr>
-              <w:t xml:space="preserve">Un roi du Boina au XVIIIᵉ siècle : il vend 200 captifs à un navire européen, reçoit 300 fusils, arme ses guerriers, lance une expédition vers l’intérieur — qui ramène de nouveaux captifs. Le cercle traite-guerre tourne, et le royaume s’étend.</w:t>
-            </w:r>
-          </w:p>
-        </w:tc>
-        <w:tc>
-          <w:tcPr>
-            <w:tcMar>
-              <w:top w:type="dxa" w:w="80"/>
-              <w:left w:type="dxa" w:w="80"/>
-              <w:bottom w:type="dxa" w:w="80"/>
-              <w:right w:type="dxa" w:w="80"/>
-            </w:tcMar>
-          </w:tcPr>
-          <w:p>
-            <w:pPr>
-              <w:spacing w:after="40"/>
-              <w:jc w:val="left"/>
-            </w:pPr>
-            <w:r>
-              <w:rPr>
-                <w:b w:val="false"/>
-                <w:bCs w:val="false"/>
-                <w:i w:val="false"/>
-                <w:iCs w:val="false"/>
-                <w:color w:val="000000"/>
-                <w:sz w:val="20"/>
-                <w:szCs w:val="20"/>
-                <w:rFonts w:ascii="Times New Roman" w:cs="Times New Roman" w:eastAsia="Times New Roman" w:hAnsi="Times New Roman"/>
-              </w:rPr>
-              <w:t xml:space="preserve">Observent l’exemple résolu.</w:t>
-            </w:r>
-          </w:p>
-        </w:tc>
-        <w:tc>
-          <w:tcPr>
-            <w:tcMar>
-              <w:top w:type="dxa" w:w="80"/>
-              <w:left w:type="dxa" w:w="80"/>
-              <w:bottom w:type="dxa" w:w="80"/>
-              <w:right w:type="dxa" w:w="80"/>
-            </w:tcMar>
-          </w:tcPr>
-          <w:p>
-            <w:pPr>
-              <w:spacing w:after="40"/>
-              <w:jc w:val="left"/>
-            </w:pPr>
-            <w:r>
-              <w:rPr>
-                <w:b w:val="false"/>
-                <w:bCs w:val="false"/>
-                <w:i w:val="false"/>
-                <w:iCs w:val="false"/>
-                <w:color w:val="000000"/>
-                <w:sz w:val="20"/>
-                <w:szCs w:val="20"/>
-                <w:rFonts w:ascii="Times New Roman" w:cs="Times New Roman" w:eastAsia="Times New Roman" w:hAnsi="Times New Roman"/>
-              </w:rPr>
-              <w:t xml:space="preserve">Observation dirigée</w:t>
-            </w:r>
-          </w:p>
-        </w:tc>
-        <w:tc>
-          <w:tcPr>
-            <w:tcMar>
-              <w:top w:type="dxa" w:w="80"/>
-              <w:left w:type="dxa" w:w="80"/>
-              <w:bottom w:type="dxa" w:w="80"/>
-              <w:right w:type="dxa" w:w="80"/>
-            </w:tcMar>
-          </w:tcPr>
-          <w:p>
-            <w:pPr>
-              <w:spacing w:after="40"/>
-              <w:jc w:val="left"/>
-            </w:pPr>
-            <w:r>
-              <w:rPr>
-                <w:b w:val="false"/>
-                <w:bCs w:val="false"/>
-                <w:i w:val="false"/>
-                <w:iCs w:val="false"/>
-                <w:color w:val="000000"/>
-                <w:sz w:val="20"/>
-                <w:szCs w:val="20"/>
-                <w:rFonts w:ascii="Times New Roman" w:cs="Times New Roman" w:eastAsia="Times New Roman" w:hAnsi="Times New Roman"/>
-              </w:rPr>
-              <w:t xml:space="preserve">Document imprimé</w:t>
-            </w:r>
-          </w:p>
-        </w:tc>
-        <w:tc>
-          <w:tcPr>
-            <w:tcMar>
-              <w:top w:type="dxa" w:w="80"/>
-              <w:left w:type="dxa" w:w="80"/>
-              <w:bottom w:type="dxa" w:w="80"/>
-              <w:right w:type="dxa" w:w="80"/>
-            </w:tcMar>
-          </w:tcPr>
-          <w:p>
-            <w:pPr>
-              <w:spacing w:after="40"/>
-              <w:jc w:val="left"/>
-            </w:pPr>
-            <w:r>
-              <w:rPr>
-                <w:b w:val="false"/>
-                <w:bCs w:val="false"/>
-                <w:i w:val="false"/>
-                <w:iCs w:val="false"/>
-                <w:color w:val="000000"/>
-                <w:sz w:val="20"/>
-                <w:szCs w:val="20"/>
-                <w:rFonts w:ascii="Times New Roman" w:cs="Times New Roman" w:eastAsia="Times New Roman" w:hAnsi="Times New Roman"/>
-              </w:rPr>
-              <w:t xml:space="preserve">Compréhension</w:t>
+              <w:t xml:space="preserve">3. Développement</w:t>
+            </w:r>
+          </w:p>
+        </w:tc>
+        <w:tc>
+          <w:tcPr>
+            <w:tcMar>
+              <w:top w:type="dxa" w:w="80"/>
+              <w:left w:type="dxa" w:w="80"/>
+              <w:bottom w:type="dxa" w:w="80"/>
+              <w:right w:type="dxa" w:w="80"/>
+            </w:tcMar>
+          </w:tcPr>
+          <w:p>
+            <w:pPr>
+              <w:spacing w:after="40"/>
+              <w:jc w:val="left"/>
+            </w:pPr>
+            <w:r>
+              <w:rPr>
+                <w:b w:val="false"/>
+                <w:bCs w:val="false"/>
+                <w:i w:val="false"/>
+                <w:iCs w:val="false"/>
+                <w:color w:val="000000"/>
+                <w:sz w:val="20"/>
+                <w:szCs w:val="20"/>
+                <w:rFonts w:ascii="Times New Roman" w:cs="Times New Roman" w:eastAsia="Times New Roman" w:hAnsi="Times New Roman"/>
+              </w:rPr>
+              <w:t xml:space="preserve">Développe la leçon partie par partie : Une société de castes ; Une économie de rizières, de zébus — et de traite ; Le roi au centre de tout.</w:t>
+            </w:r>
+          </w:p>
+        </w:tc>
+        <w:tc>
+          <w:tcPr>
+            <w:tcMar>
+              <w:top w:type="dxa" w:w="80"/>
+              <w:left w:type="dxa" w:w="80"/>
+              <w:bottom w:type="dxa" w:w="80"/>
+              <w:right w:type="dxa" w:w="80"/>
+            </w:tcMar>
+          </w:tcPr>
+          <w:p>
+            <w:pPr>
+              <w:spacing w:after="40"/>
+              <w:jc w:val="left"/>
+            </w:pPr>
+            <w:r>
+              <w:rPr>
+                <w:b w:val="false"/>
+                <w:bCs w:val="false"/>
+                <w:i w:val="false"/>
+                <w:iCs w:val="false"/>
+                <w:color w:val="000000"/>
+                <w:sz w:val="20"/>
+                <w:szCs w:val="20"/>
+                <w:rFonts w:ascii="Times New Roman" w:cs="Times New Roman" w:eastAsia="Times New Roman" w:hAnsi="Times New Roman"/>
+              </w:rPr>
+              <w:t xml:space="preserve">Écoutent, répondent aux questions et notent les mots-clés.</w:t>
+            </w:r>
+          </w:p>
+        </w:tc>
+        <w:tc>
+          <w:tcPr>
+            <w:tcMar>
+              <w:top w:type="dxa" w:w="80"/>
+              <w:left w:type="dxa" w:w="80"/>
+              <w:bottom w:type="dxa" w:w="80"/>
+              <w:right w:type="dxa" w:w="80"/>
+            </w:tcMar>
+          </w:tcPr>
+          <w:p>
+            <w:pPr>
+              <w:spacing w:after="40"/>
+              <w:jc w:val="left"/>
+            </w:pPr>
+            <w:r>
+              <w:rPr>
+                <w:b w:val="false"/>
+                <w:bCs w:val="false"/>
+                <w:i w:val="false"/>
+                <w:iCs w:val="false"/>
+                <w:color w:val="000000"/>
+                <w:sz w:val="20"/>
+                <w:szCs w:val="20"/>
+                <w:rFonts w:ascii="Times New Roman" w:cs="Times New Roman" w:eastAsia="Times New Roman" w:hAnsi="Times New Roman"/>
+              </w:rPr>
+              <w:t xml:space="preserve">Exposé interactif, questions-réponses</w:t>
+            </w:r>
+          </w:p>
+        </w:tc>
+        <w:tc>
+          <w:tcPr>
+            <w:tcMar>
+              <w:top w:type="dxa" w:w="80"/>
+              <w:left w:type="dxa" w:w="80"/>
+              <w:bottom w:type="dxa" w:w="80"/>
+              <w:right w:type="dxa" w:w="80"/>
+            </w:tcMar>
+          </w:tcPr>
+          <w:p>
+            <w:pPr>
+              <w:spacing w:after="40"/>
+              <w:jc w:val="left"/>
+            </w:pPr>
+            <w:r>
+              <w:rPr>
+                <w:b w:val="false"/>
+                <w:bCs w:val="false"/>
+                <w:i w:val="false"/>
+                <w:iCs w:val="false"/>
+                <w:color w:val="000000"/>
+                <w:sz w:val="20"/>
+                <w:szCs w:val="20"/>
+                <w:rFonts w:ascii="Times New Roman" w:cs="Times New Roman" w:eastAsia="Times New Roman" w:hAnsi="Times New Roman"/>
+              </w:rPr>
+              <w:t xml:space="preserve">Tableau, frises, cartes</w:t>
+            </w:r>
+          </w:p>
+        </w:tc>
+        <w:tc>
+          <w:tcPr>
+            <w:tcMar>
+              <w:top w:type="dxa" w:w="80"/>
+              <w:left w:type="dxa" w:w="80"/>
+              <w:bottom w:type="dxa" w:w="80"/>
+              <w:right w:type="dxa" w:w="80"/>
+            </w:tcMar>
+          </w:tcPr>
+          <w:p>
+            <w:pPr>
+              <w:spacing w:after="40"/>
+              <w:jc w:val="left"/>
+            </w:pPr>
+            <w:r>
+              <w:rPr>
+                <w:b w:val="false"/>
+                <w:bCs w:val="false"/>
+                <w:i w:val="false"/>
+                <w:iCs w:val="false"/>
+                <w:color w:val="000000"/>
+                <w:sz w:val="20"/>
+                <w:szCs w:val="20"/>
+                <w:rFonts w:ascii="Times New Roman" w:cs="Times New Roman" w:eastAsia="Times New Roman" w:hAnsi="Times New Roman"/>
+              </w:rPr>
+              <w:t xml:space="preserve">Attention, participation</w:t>
             </w:r>
           </w:p>
         </w:tc>
@@ -4884,152 +5951,152 @@
                 <w:szCs w:val="20"/>
                 <w:rFonts w:ascii="Times New Roman" w:cs="Times New Roman" w:eastAsia="Times New Roman" w:hAnsi="Times New Roman"/>
               </w:rPr>
-              <w:t xml:space="preserve">4. Analyse</w:t>
-            </w:r>
-          </w:p>
-        </w:tc>
-        <w:tc>
-          <w:tcPr>
-            <w:tcMar>
-              <w:top w:type="dxa" w:w="80"/>
-              <w:left w:type="dxa" w:w="80"/>
-              <w:bottom w:type="dxa" w:w="80"/>
-              <w:right w:type="dxa" w:w="80"/>
-            </w:tcMar>
-          </w:tcPr>
-          <w:p>
-            <w:pPr>
-              <w:spacing w:after="40"/>
-              <w:jc w:val="left"/>
-            </w:pPr>
-            <w:r>
-              <w:rPr>
-                <w:b w:val="false"/>
-                <w:bCs w:val="false"/>
-                <w:i w:val="false"/>
-                <w:iCs w:val="false"/>
-                <w:color w:val="000000"/>
-                <w:sz w:val="20"/>
-                <w:szCs w:val="20"/>
-                <w:rFonts w:ascii="Times New Roman" w:cs="Times New Roman" w:eastAsia="Times New Roman" w:hAnsi="Times New Roman"/>
-              </w:rPr>
-              <w:t xml:space="preserve">Guide l’analyse : La société d’abord. La caste est un groupe héréditaire : on y naît, on s’y marie, on ne la quitte pas. Chez les Merina : les Andriana, nobles apparentés au souverain, répartis en sous-groupes avec leurs privilèges ; les Hova, hommes libres, cultivateurs, artisans, commerçants — la masse de la population ; et les andevo, non-libres, attachés au service des deux premiers groupes. Les autres royaumes ont la même architecture sous d’autres noms : chez les Sakalava, les nobles sont les ampanjaka, et les hommes libres ont leurs propres appellations régionales. L’économie ensuite. Partout, l’agriculture — riz des Hautes Terres et des vallées de l’est, cultures sèches du sud — et l’élevage du zébu, richesse, monnaie et offrande à la fois. Mais les royaumes côtiers, puis l’Imerina, s’enrichissent aussi de la traite des esclaves : des captifs de guerre sont vendus aux marchands arabes et européens contre fusils, poudre, piastres et étoffes — commerce tragique qui alimente les guerres, car il faut des expéditions pour « produire » des captifs. La politique enfin. Le roi est au centre de tout : maître de la terre, juge suprême, chef religieux lié aux ancêtres royaux ; les grandes décisions s’annoncent au peuple assemblé — le kabary. Sa puissance se mesure à ses expéditions militaires : les rois sakalava du Menabe puis du Boina soumettent l’ouest au XVIIᵉ siècle ; les rois merina, au tournant du XIXᵉ, unifient les Hautes Terres. Nos connaissances viennent des traditions orales et des récits des voyageurs — dont l’œuvre monumentale d’Alfred Grandidier, qui décrivit l’île et ses sociétés au XIXᵉ siècle.</w:t>
-            </w:r>
-          </w:p>
-        </w:tc>
-        <w:tc>
-          <w:tcPr>
-            <w:tcMar>
-              <w:top w:type="dxa" w:w="80"/>
-              <w:left w:type="dxa" w:w="80"/>
-              <w:bottom w:type="dxa" w:w="80"/>
-              <w:right w:type="dxa" w:w="80"/>
-            </w:tcMar>
-          </w:tcPr>
-          <w:p>
-            <w:pPr>
-              <w:spacing w:after="40"/>
-              <w:jc w:val="left"/>
-            </w:pPr>
-            <w:r>
-              <w:rPr>
-                <w:b w:val="false"/>
-                <w:bCs w:val="false"/>
-                <w:i w:val="false"/>
-                <w:iCs w:val="false"/>
-                <w:color w:val="000000"/>
-                <w:sz w:val="20"/>
-                <w:szCs w:val="20"/>
-                <w:rFonts w:ascii="Times New Roman" w:cs="Times New Roman" w:eastAsia="Times New Roman" w:hAnsi="Times New Roman"/>
-              </w:rPr>
-              <w:t xml:space="preserve">Expliquent la démarche et vérifient le résultat.</w:t>
-            </w:r>
-          </w:p>
-        </w:tc>
-        <w:tc>
-          <w:tcPr>
-            <w:tcMar>
-              <w:top w:type="dxa" w:w="80"/>
-              <w:left w:type="dxa" w:w="80"/>
-              <w:bottom w:type="dxa" w:w="80"/>
-              <w:right w:type="dxa" w:w="80"/>
-            </w:tcMar>
-          </w:tcPr>
-          <w:p>
-            <w:pPr>
-              <w:spacing w:after="40"/>
-              <w:jc w:val="left"/>
-            </w:pPr>
-            <w:r>
-              <w:rPr>
-                <w:b w:val="false"/>
-                <w:bCs w:val="false"/>
-                <w:i w:val="false"/>
-                <w:iCs w:val="false"/>
-                <w:color w:val="000000"/>
-                <w:sz w:val="20"/>
-                <w:szCs w:val="20"/>
-                <w:rFonts w:ascii="Times New Roman" w:cs="Times New Roman" w:eastAsia="Times New Roman" w:hAnsi="Times New Roman"/>
-              </w:rPr>
-              <w:t xml:space="preserve">Recherche en binômes</w:t>
-            </w:r>
-          </w:p>
-        </w:tc>
-        <w:tc>
-          <w:tcPr>
-            <w:tcMar>
-              <w:top w:type="dxa" w:w="80"/>
-              <w:left w:type="dxa" w:w="80"/>
-              <w:bottom w:type="dxa" w:w="80"/>
-              <w:right w:type="dxa" w:w="80"/>
-            </w:tcMar>
-          </w:tcPr>
-          <w:p>
-            <w:pPr>
-              <w:spacing w:after="40"/>
-              <w:jc w:val="left"/>
-            </w:pPr>
-            <w:r>
-              <w:rPr>
-                <w:b w:val="false"/>
-                <w:bCs w:val="false"/>
-                <w:i w:val="false"/>
-                <w:iCs w:val="false"/>
-                <w:color w:val="000000"/>
-                <w:sz w:val="20"/>
-                <w:szCs w:val="20"/>
-                <w:rFonts w:ascii="Times New Roman" w:cs="Times New Roman" w:eastAsia="Times New Roman" w:hAnsi="Times New Roman"/>
-              </w:rPr>
-              <w:t xml:space="preserve">Documents, cartes, frises</w:t>
-            </w:r>
-          </w:p>
-        </w:tc>
-        <w:tc>
-          <w:tcPr>
-            <w:tcMar>
-              <w:top w:type="dxa" w:w="80"/>
-              <w:left w:type="dxa" w:w="80"/>
-              <w:bottom w:type="dxa" w:w="80"/>
-              <w:right w:type="dxa" w:w="80"/>
-            </w:tcMar>
-          </w:tcPr>
-          <w:p>
-            <w:pPr>
-              <w:spacing w:after="40"/>
-              <w:jc w:val="left"/>
-            </w:pPr>
-            <w:r>
-              <w:rPr>
-                <w:b w:val="false"/>
-                <w:bCs w:val="false"/>
-                <w:i w:val="false"/>
-                <w:iCs w:val="false"/>
-                <w:color w:val="000000"/>
-                <w:sz w:val="20"/>
-                <w:szCs w:val="20"/>
-                <w:rFonts w:ascii="Times New Roman" w:cs="Times New Roman" w:eastAsia="Times New Roman" w:hAnsi="Times New Roman"/>
-              </w:rPr>
-              <w:t xml:space="preserve">Raisonnement</w:t>
+              <w:t xml:space="preserve">4. Étude de document</w:t>
+            </w:r>
+          </w:p>
+        </w:tc>
+        <w:tc>
+          <w:tcPr>
+            <w:tcMar>
+              <w:top w:type="dxa" w:w="80"/>
+              <w:left w:type="dxa" w:w="80"/>
+              <w:bottom w:type="dxa" w:w="80"/>
+              <w:right w:type="dxa" w:w="80"/>
+            </w:tcMar>
+          </w:tcPr>
+          <w:p>
+            <w:pPr>
+              <w:spacing w:after="40"/>
+              <w:jc w:val="left"/>
+            </w:pPr>
+            <w:r>
+              <w:rPr>
+                <w:b w:val="false"/>
+                <w:bCs w:val="false"/>
+                <w:i w:val="false"/>
+                <w:iCs w:val="false"/>
+                <w:color w:val="000000"/>
+                <w:sz w:val="20"/>
+                <w:szCs w:val="20"/>
+                <w:rFonts w:ascii="Times New Roman" w:cs="Times New Roman" w:eastAsia="Times New Roman" w:hAnsi="Times New Roman"/>
+              </w:rPr>
+              <w:t xml:space="preserve">Fait lire le document « Le pouvoir des rois sakalava » (d’après Alfred et Guillaume Grandidier, Histoire physique, naturelle et politique de Madagascar (fin XIXᵉ siècle) — extrait adapté), puis pose les questions.</w:t>
+            </w:r>
+          </w:p>
+        </w:tc>
+        <w:tc>
+          <w:tcPr>
+            <w:tcMar>
+              <w:top w:type="dxa" w:w="80"/>
+              <w:left w:type="dxa" w:w="80"/>
+              <w:bottom w:type="dxa" w:w="80"/>
+              <w:right w:type="dxa" w:w="80"/>
+            </w:tcMar>
+          </w:tcPr>
+          <w:p>
+            <w:pPr>
+              <w:spacing w:after="40"/>
+              <w:jc w:val="left"/>
+            </w:pPr>
+            <w:r>
+              <w:rPr>
+                <w:b w:val="false"/>
+                <w:bCs w:val="false"/>
+                <w:i w:val="false"/>
+                <w:iCs w:val="false"/>
+                <w:color w:val="000000"/>
+                <w:sz w:val="20"/>
+                <w:szCs w:val="20"/>
+                <w:rFonts w:ascii="Times New Roman" w:cs="Times New Roman" w:eastAsia="Times New Roman" w:hAnsi="Times New Roman"/>
+              </w:rPr>
+              <w:t xml:space="preserve">Lisent le document, répondent aux questions et critiquent la source.</w:t>
+            </w:r>
+          </w:p>
+        </w:tc>
+        <w:tc>
+          <w:tcPr>
+            <w:tcMar>
+              <w:top w:type="dxa" w:w="80"/>
+              <w:left w:type="dxa" w:w="80"/>
+              <w:bottom w:type="dxa" w:w="80"/>
+              <w:right w:type="dxa" w:w="80"/>
+            </w:tcMar>
+          </w:tcPr>
+          <w:p>
+            <w:pPr>
+              <w:spacing w:after="40"/>
+              <w:jc w:val="left"/>
+            </w:pPr>
+            <w:r>
+              <w:rPr>
+                <w:b w:val="false"/>
+                <w:bCs w:val="false"/>
+                <w:i w:val="false"/>
+                <w:iCs w:val="false"/>
+                <w:color w:val="000000"/>
+                <w:sz w:val="20"/>
+                <w:szCs w:val="20"/>
+                <w:rFonts w:ascii="Times New Roman" w:cs="Times New Roman" w:eastAsia="Times New Roman" w:hAnsi="Times New Roman"/>
+              </w:rPr>
+              <w:t xml:space="preserve">Observation dirigée, travail en binômes</w:t>
+            </w:r>
+          </w:p>
+        </w:tc>
+        <w:tc>
+          <w:tcPr>
+            <w:tcMar>
+              <w:top w:type="dxa" w:w="80"/>
+              <w:left w:type="dxa" w:w="80"/>
+              <w:bottom w:type="dxa" w:w="80"/>
+              <w:right w:type="dxa" w:w="80"/>
+            </w:tcMar>
+          </w:tcPr>
+          <w:p>
+            <w:pPr>
+              <w:spacing w:after="40"/>
+              <w:jc w:val="left"/>
+            </w:pPr>
+            <w:r>
+              <w:rPr>
+                <w:b w:val="false"/>
+                <w:bCs w:val="false"/>
+                <w:i w:val="false"/>
+                <w:iCs w:val="false"/>
+                <w:color w:val="000000"/>
+                <w:sz w:val="20"/>
+                <w:szCs w:val="20"/>
+                <w:rFonts w:ascii="Times New Roman" w:cs="Times New Roman" w:eastAsia="Times New Roman" w:hAnsi="Times New Roman"/>
+              </w:rPr>
+              <w:t xml:space="preserve">Document imprimé</w:t>
+            </w:r>
+          </w:p>
+        </w:tc>
+        <w:tc>
+          <w:tcPr>
+            <w:tcMar>
+              <w:top w:type="dxa" w:w="80"/>
+              <w:left w:type="dxa" w:w="80"/>
+              <w:bottom w:type="dxa" w:w="80"/>
+              <w:right w:type="dxa" w:w="80"/>
+            </w:tcMar>
+          </w:tcPr>
+          <w:p>
+            <w:pPr>
+              <w:spacing w:after="40"/>
+              <w:jc w:val="left"/>
+            </w:pPr>
+            <w:r>
+              <w:rPr>
+                <w:b w:val="false"/>
+                <w:bCs w:val="false"/>
+                <w:i w:val="false"/>
+                <w:iCs w:val="false"/>
+                <w:color w:val="000000"/>
+                <w:sz w:val="20"/>
+                <w:szCs w:val="20"/>
+                <w:rFonts w:ascii="Times New Roman" w:cs="Times New Roman" w:eastAsia="Times New Roman" w:hAnsi="Times New Roman"/>
+              </w:rPr>
+              <w:t xml:space="preserve">Esprit critique</w:t>
             </w:r>
           </w:p>
         </w:tc>
@@ -5635,7 +6702,26 @@
     </w:p>
     <w:p>
       <w:pPr>
-        <w:spacing w:after="110" w:line="300"/>
+        <w:spacing w:after="160" w:line="300"/>
+        <w:jc w:val="center"/>
+      </w:pPr>
+      <w:r>
+        <w:rPr>
+          <w:b w:val="false"/>
+          <w:bCs w:val="false"/>
+          <w:i/>
+          <w:iCs/>
+          <w:color w:val="000000"/>
+          <w:sz w:val="21"/>
+          <w:szCs w:val="21"/>
+          <w:rFonts w:ascii="Times New Roman" w:cs="Times New Roman" w:eastAsia="Times New Roman" w:hAnsi="Times New Roman"/>
+        </w:rPr>
+        <w:t xml:space="preserve">Castes, rizières, zébus et kabary : les trois piliers — société, économie, pouvoir royal.</w:t>
+      </w:r>
+    </w:p>
+    <w:p>
+      <w:pPr>
+        <w:spacing w:after="80" w:line="300"/>
         <w:jc w:val="both"/>
       </w:pPr>
       <w:r>
@@ -5645,11 +6731,30 @@
           <w:i w:val="false"/>
           <w:iCs w:val="false"/>
           <w:color w:val="2E7D32"/>
-          <w:sz w:val="24"/>
-          <w:szCs w:val="24"/>
-          <w:rFonts w:ascii="Times New Roman" w:cs="Times New Roman" w:eastAsia="Times New Roman" w:hAnsi="Times New Roman"/>
-        </w:rPr>
-        <w:t xml:space="preserve">Définition — </w:t>
+          <w:sz w:val="26"/>
+          <w:szCs w:val="26"/>
+          <w:rFonts w:ascii="Times New Roman" w:cs="Times New Roman" w:eastAsia="Times New Roman" w:hAnsi="Times New Roman"/>
+        </w:rPr>
+        <w:t xml:space="preserve">1. Une société de castes</w:t>
+      </w:r>
+    </w:p>
+    <w:p>
+      <w:pPr>
+        <w:spacing w:after="100" w:line="300"/>
+        <w:jc w:val="both"/>
+      </w:pPr>
+      <w:r>
+        <w:rPr>
+          <w:b w:val="false"/>
+          <w:bCs w:val="false"/>
+          <w:i w:val="false"/>
+          <w:iCs w:val="false"/>
+          <w:color w:val="000000"/>
+          <w:sz w:val="24"/>
+          <w:szCs w:val="24"/>
+          <w:rFonts w:ascii="Times New Roman" w:cs="Times New Roman" w:eastAsia="Times New Roman" w:hAnsi="Times New Roman"/>
+        </w:rPr>
+        <w:t xml:space="preserve">La </w:t>
       </w:r>
       <w:r>
         <w:rPr>
@@ -5657,19 +6762,26 @@
           <w:bCs/>
           <w:i w:val="false"/>
           <w:iCs w:val="false"/>
+          <w:color w:val="1F4E79"/>
+          <w:sz w:val="24"/>
+          <w:szCs w:val="24"/>
+          <w:rFonts w:ascii="Times New Roman" w:cs="Times New Roman" w:eastAsia="Times New Roman" w:hAnsi="Times New Roman"/>
+        </w:rPr>
+        <w:t xml:space="preserve">caste</w:t>
+      </w:r>
+      <w:r>
+        <w:rPr>
+          <w:b w:val="false"/>
+          <w:bCs w:val="false"/>
+          <w:i w:val="false"/>
+          <w:iCs w:val="false"/>
           <w:color w:val="000000"/>
           <w:sz w:val="24"/>
           <w:szCs w:val="24"/>
           <w:rFonts w:ascii="Times New Roman" w:cs="Times New Roman" w:eastAsia="Times New Roman" w:hAnsi="Times New Roman"/>
         </w:rPr>
-        <w:t xml:space="preserve">La société des royaumes malgaches est divisée en castes : les libres — Andriana (nobles) et Hova (hommes libres) — et les non-libres — les andevo ; les appellations varient selon les régions. L’économie repose sur l’agriculture et l’élevage, et sur la traite des esclaves avec les marchands étrangers. En politique, le roi occupe la place centrale et mène des expéditions militaires — comme le montrent les exemples merina et sakalava, décrits notamment par Grandidier.</w:t>
-      </w:r>
-    </w:p>
-    <w:p>
-      <w:pPr>
-        <w:spacing w:after="110" w:line="300"/>
-        <w:jc w:val="both"/>
-      </w:pPr>
+        <w:t xml:space="preserve"> est un groupe héréditaire : on y naît, on s’y marie, on ne la quitte pas. Chez les Merina : les </w:t>
+      </w:r>
       <w:r>
         <w:rPr>
           <w:b/>
@@ -5681,7 +6793,7 @@
           <w:szCs w:val="24"/>
           <w:rFonts w:ascii="Times New Roman" w:cs="Times New Roman" w:eastAsia="Times New Roman" w:hAnsi="Times New Roman"/>
         </w:rPr>
-        <w:t xml:space="preserve">Autrement dit : </w:t>
+        <w:t xml:space="preserve">Andriana</w:t>
       </w:r>
       <w:r>
         <w:rPr>
@@ -5694,14 +6806,21 @@
           <w:szCs w:val="24"/>
           <w:rFonts w:ascii="Times New Roman" w:cs="Times New Roman" w:eastAsia="Times New Roman" w:hAnsi="Times New Roman"/>
         </w:rPr>
-        <w:t xml:space="preserve">trois groupes de naissance — nobles, hommes libres, non-libres ; une économie de rizières, de zébus et, hélas, de traite ; et au centre de tout, le roi, qui fait la guerre pour étendre son royaume.</w:t>
-      </w:r>
-    </w:p>
-    <w:p>
-      <w:pPr>
-        <w:spacing w:after="110" w:line="300"/>
-        <w:jc w:val="both"/>
-      </w:pPr>
+        <w:t xml:space="preserve">, nobles apparentés au souverain, répartis en sous-groupes avec leurs privilèges ; les </w:t>
+      </w:r>
+      <w:r>
+        <w:rPr>
+          <w:b/>
+          <w:bCs/>
+          <w:i w:val="false"/>
+          <w:iCs w:val="false"/>
+          <w:color w:val="1F4E79"/>
+          <w:sz w:val="24"/>
+          <w:szCs w:val="24"/>
+          <w:rFonts w:ascii="Times New Roman" w:cs="Times New Roman" w:eastAsia="Times New Roman" w:hAnsi="Times New Roman"/>
+        </w:rPr>
+        <w:t xml:space="preserve">Hova</w:t>
+      </w:r>
       <w:r>
         <w:rPr>
           <w:b w:val="false"/>
@@ -5713,7 +6832,433 @@
           <w:szCs w:val="24"/>
           <w:rFonts w:ascii="Times New Roman" w:cs="Times New Roman" w:eastAsia="Times New Roman" w:hAnsi="Times New Roman"/>
         </w:rPr>
-        <w:t xml:space="preserve">La société d’abord. La caste est un groupe héréditaire : on y naît, on s’y marie, on ne la quitte pas. Chez les Merina : les Andriana, nobles apparentés au souverain, répartis en sous-groupes avec leurs privilèges ; les Hova, hommes libres, cultivateurs, artisans, commerçants — la masse de la population ; et les andevo, non-libres, attachés au service des deux premiers groupes. Les autres royaumes ont la même architecture sous d’autres noms : chez les Sakalava, les nobles sont les ampanjaka, et les hommes libres ont leurs propres appellations régionales. L’économie ensuite. Partout, l’agriculture — riz des Hautes Terres et des vallées de l’est, cultures sèches du sud — et l’élevage du zébu, richesse, monnaie et offrande à la fois. Mais les royaumes côtiers, puis l’Imerina, s’enrichissent aussi de la traite des esclaves : des captifs de guerre sont vendus aux marchands arabes et européens contre fusils, poudre, piastres et étoffes — commerce tragique qui alimente les guerres, car il faut des expéditions pour « produire » des captifs. La politique enfin. Le roi est au centre de tout : maître de la terre, juge suprême, chef religieux lié aux ancêtres royaux ; les grandes décisions s’annoncent au peuple assemblé — le kabary. Sa puissance se mesure à ses expéditions militaires : les rois sakalava du Menabe puis du Boina soumettent l’ouest au XVIIᵉ siècle ; les rois merina, au tournant du XIXᵉ, unifient les Hautes Terres. Nos connaissances viennent des traditions orales et des récits des voyageurs — dont l’œuvre monumentale d’Alfred Grandidier, qui décrivit l’île et ses sociétés au XIXᵉ siècle.</w:t>
+        <w:t xml:space="preserve">, hommes libres, cultivateurs, artisans, commerçants — la masse de la population ; et les </w:t>
+      </w:r>
+      <w:r>
+        <w:rPr>
+          <w:b/>
+          <w:bCs/>
+          <w:i w:val="false"/>
+          <w:iCs w:val="false"/>
+          <w:color w:val="1F4E79"/>
+          <w:sz w:val="24"/>
+          <w:szCs w:val="24"/>
+          <w:rFonts w:ascii="Times New Roman" w:cs="Times New Roman" w:eastAsia="Times New Roman" w:hAnsi="Times New Roman"/>
+        </w:rPr>
+        <w:t xml:space="preserve">andevo</w:t>
+      </w:r>
+      <w:r>
+        <w:rPr>
+          <w:b w:val="false"/>
+          <w:bCs w:val="false"/>
+          <w:i w:val="false"/>
+          <w:iCs w:val="false"/>
+          <w:color w:val="000000"/>
+          <w:sz w:val="24"/>
+          <w:szCs w:val="24"/>
+          <w:rFonts w:ascii="Times New Roman" w:cs="Times New Roman" w:eastAsia="Times New Roman" w:hAnsi="Times New Roman"/>
+        </w:rPr>
+        <w:t xml:space="preserve">, non-libres, attachés au service des deux premiers groupes. Les autres royaumes ont la même architecture sous d’autres noms : chez les Sakalava, les nobles sont les </w:t>
+      </w:r>
+      <w:r>
+        <w:rPr>
+          <w:b/>
+          <w:bCs/>
+          <w:i w:val="false"/>
+          <w:iCs w:val="false"/>
+          <w:color w:val="1F4E79"/>
+          <w:sz w:val="24"/>
+          <w:szCs w:val="24"/>
+          <w:rFonts w:ascii="Times New Roman" w:cs="Times New Roman" w:eastAsia="Times New Roman" w:hAnsi="Times New Roman"/>
+        </w:rPr>
+        <w:t xml:space="preserve">ampanjaka</w:t>
+      </w:r>
+      <w:r>
+        <w:rPr>
+          <w:b w:val="false"/>
+          <w:bCs w:val="false"/>
+          <w:i w:val="false"/>
+          <w:iCs w:val="false"/>
+          <w:color w:val="000000"/>
+          <w:sz w:val="24"/>
+          <w:szCs w:val="24"/>
+          <w:rFonts w:ascii="Times New Roman" w:cs="Times New Roman" w:eastAsia="Times New Roman" w:hAnsi="Times New Roman"/>
+        </w:rPr>
+        <w:t xml:space="preserve">, et les hommes libres ont leurs propres appellations régionales.</w:t>
+      </w:r>
+    </w:p>
+    <w:p>
+      <w:pPr>
+        <w:spacing w:after="80" w:line="300"/>
+        <w:jc w:val="both"/>
+      </w:pPr>
+      <w:r>
+        <w:rPr>
+          <w:b/>
+          <w:bCs/>
+          <w:i w:val="false"/>
+          <w:iCs w:val="false"/>
+          <w:color w:val="2E7D32"/>
+          <w:sz w:val="26"/>
+          <w:szCs w:val="26"/>
+          <w:rFonts w:ascii="Times New Roman" w:cs="Times New Roman" w:eastAsia="Times New Roman" w:hAnsi="Times New Roman"/>
+        </w:rPr>
+        <w:t xml:space="preserve">2. Une économie de rizières, de zébus — et de traite</w:t>
+      </w:r>
+    </w:p>
+    <w:p>
+      <w:pPr>
+        <w:spacing w:after="100" w:line="300"/>
+        <w:jc w:val="both"/>
+      </w:pPr>
+      <w:r>
+        <w:rPr>
+          <w:b w:val="false"/>
+          <w:bCs w:val="false"/>
+          <w:i w:val="false"/>
+          <w:iCs w:val="false"/>
+          <w:color w:val="000000"/>
+          <w:sz w:val="24"/>
+          <w:szCs w:val="24"/>
+          <w:rFonts w:ascii="Times New Roman" w:cs="Times New Roman" w:eastAsia="Times New Roman" w:hAnsi="Times New Roman"/>
+        </w:rPr>
+        <w:t xml:space="preserve">Partout, l’</w:t>
+      </w:r>
+      <w:r>
+        <w:rPr>
+          <w:b/>
+          <w:bCs/>
+          <w:i w:val="false"/>
+          <w:iCs w:val="false"/>
+          <w:color w:val="1F4E79"/>
+          <w:sz w:val="24"/>
+          <w:szCs w:val="24"/>
+          <w:rFonts w:ascii="Times New Roman" w:cs="Times New Roman" w:eastAsia="Times New Roman" w:hAnsi="Times New Roman"/>
+        </w:rPr>
+        <w:t xml:space="preserve">agriculture</w:t>
+      </w:r>
+      <w:r>
+        <w:rPr>
+          <w:b w:val="false"/>
+          <w:bCs w:val="false"/>
+          <w:i w:val="false"/>
+          <w:iCs w:val="false"/>
+          <w:color w:val="000000"/>
+          <w:sz w:val="24"/>
+          <w:szCs w:val="24"/>
+          <w:rFonts w:ascii="Times New Roman" w:cs="Times New Roman" w:eastAsia="Times New Roman" w:hAnsi="Times New Roman"/>
+        </w:rPr>
+        <w:t xml:space="preserve"> — riz des Hautes Terres et des vallées de l’est, cultures sèches du sud — et l’</w:t>
+      </w:r>
+      <w:r>
+        <w:rPr>
+          <w:b/>
+          <w:bCs/>
+          <w:i w:val="false"/>
+          <w:iCs w:val="false"/>
+          <w:color w:val="1F4E79"/>
+          <w:sz w:val="24"/>
+          <w:szCs w:val="24"/>
+          <w:rFonts w:ascii="Times New Roman" w:cs="Times New Roman" w:eastAsia="Times New Roman" w:hAnsi="Times New Roman"/>
+        </w:rPr>
+        <w:t xml:space="preserve">élevage</w:t>
+      </w:r>
+      <w:r>
+        <w:rPr>
+          <w:b w:val="false"/>
+          <w:bCs w:val="false"/>
+          <w:i w:val="false"/>
+          <w:iCs w:val="false"/>
+          <w:color w:val="000000"/>
+          <w:sz w:val="24"/>
+          <w:szCs w:val="24"/>
+          <w:rFonts w:ascii="Times New Roman" w:cs="Times New Roman" w:eastAsia="Times New Roman" w:hAnsi="Times New Roman"/>
+        </w:rPr>
+        <w:t xml:space="preserve"> du </w:t>
+      </w:r>
+      <w:r>
+        <w:rPr>
+          <w:b/>
+          <w:bCs/>
+          <w:i w:val="false"/>
+          <w:iCs w:val="false"/>
+          <w:color w:val="1F4E79"/>
+          <w:sz w:val="24"/>
+          <w:szCs w:val="24"/>
+          <w:rFonts w:ascii="Times New Roman" w:cs="Times New Roman" w:eastAsia="Times New Roman" w:hAnsi="Times New Roman"/>
+        </w:rPr>
+        <w:t xml:space="preserve">zébu</w:t>
+      </w:r>
+      <w:r>
+        <w:rPr>
+          <w:b w:val="false"/>
+          <w:bCs w:val="false"/>
+          <w:i w:val="false"/>
+          <w:iCs w:val="false"/>
+          <w:color w:val="000000"/>
+          <w:sz w:val="24"/>
+          <w:szCs w:val="24"/>
+          <w:rFonts w:ascii="Times New Roman" w:cs="Times New Roman" w:eastAsia="Times New Roman" w:hAnsi="Times New Roman"/>
+        </w:rPr>
+        <w:t xml:space="preserve">, richesse, monnaie et offrande à la fois.</w:t>
+      </w:r>
+    </w:p>
+    <w:p>
+      <w:pPr>
+        <w:spacing w:after="100" w:line="300"/>
+        <w:jc w:val="both"/>
+      </w:pPr>
+      <w:r>
+        <w:rPr>
+          <w:b w:val="false"/>
+          <w:bCs w:val="false"/>
+          <w:i w:val="false"/>
+          <w:iCs w:val="false"/>
+          <w:color w:val="000000"/>
+          <w:sz w:val="24"/>
+          <w:szCs w:val="24"/>
+          <w:rFonts w:ascii="Times New Roman" w:cs="Times New Roman" w:eastAsia="Times New Roman" w:hAnsi="Times New Roman"/>
+        </w:rPr>
+        <w:t xml:space="preserve">Mais les royaumes côtiers, puis l’Imerina, s’enrichissent aussi de la </w:t>
+      </w:r>
+      <w:r>
+        <w:rPr>
+          <w:b/>
+          <w:bCs/>
+          <w:i w:val="false"/>
+          <w:iCs w:val="false"/>
+          <w:color w:val="1F4E79"/>
+          <w:sz w:val="24"/>
+          <w:szCs w:val="24"/>
+          <w:rFonts w:ascii="Times New Roman" w:cs="Times New Roman" w:eastAsia="Times New Roman" w:hAnsi="Times New Roman"/>
+        </w:rPr>
+        <w:t xml:space="preserve">traite des esclaves</w:t>
+      </w:r>
+      <w:r>
+        <w:rPr>
+          <w:b w:val="false"/>
+          <w:bCs w:val="false"/>
+          <w:i w:val="false"/>
+          <w:iCs w:val="false"/>
+          <w:color w:val="000000"/>
+          <w:sz w:val="24"/>
+          <w:szCs w:val="24"/>
+          <w:rFonts w:ascii="Times New Roman" w:cs="Times New Roman" w:eastAsia="Times New Roman" w:hAnsi="Times New Roman"/>
+        </w:rPr>
+        <w:t xml:space="preserve"> : des captifs de guerre sont vendus aux marchands arabes et européens contre fusils, poudre, piastres et étoffes — commerce tragique qui alimente les guerres, car il faut des expéditions pour « produire » des captifs.</w:t>
+      </w:r>
+    </w:p>
+    <w:p>
+      <w:pPr>
+        <w:spacing w:after="80" w:line="300"/>
+        <w:jc w:val="both"/>
+      </w:pPr>
+      <w:r>
+        <w:rPr>
+          <w:b/>
+          <w:bCs/>
+          <w:i w:val="false"/>
+          <w:iCs w:val="false"/>
+          <w:color w:val="2E7D32"/>
+          <w:sz w:val="26"/>
+          <w:szCs w:val="26"/>
+          <w:rFonts w:ascii="Times New Roman" w:cs="Times New Roman" w:eastAsia="Times New Roman" w:hAnsi="Times New Roman"/>
+        </w:rPr>
+        <w:t xml:space="preserve">3. Le roi au centre de tout</w:t>
+      </w:r>
+    </w:p>
+    <w:p>
+      <w:pPr>
+        <w:spacing w:after="100" w:line="300"/>
+        <w:jc w:val="both"/>
+      </w:pPr>
+      <w:r>
+        <w:rPr>
+          <w:b w:val="false"/>
+          <w:bCs w:val="false"/>
+          <w:i w:val="false"/>
+          <w:iCs w:val="false"/>
+          <w:color w:val="000000"/>
+          <w:sz w:val="24"/>
+          <w:szCs w:val="24"/>
+          <w:rFonts w:ascii="Times New Roman" w:cs="Times New Roman" w:eastAsia="Times New Roman" w:hAnsi="Times New Roman"/>
+        </w:rPr>
+        <w:t xml:space="preserve">Le </w:t>
+      </w:r>
+      <w:r>
+        <w:rPr>
+          <w:b/>
+          <w:bCs/>
+          <w:i w:val="false"/>
+          <w:iCs w:val="false"/>
+          <w:color w:val="1F4E79"/>
+          <w:sz w:val="24"/>
+          <w:szCs w:val="24"/>
+          <w:rFonts w:ascii="Times New Roman" w:cs="Times New Roman" w:eastAsia="Times New Roman" w:hAnsi="Times New Roman"/>
+        </w:rPr>
+        <w:t xml:space="preserve">roi</w:t>
+      </w:r>
+      <w:r>
+        <w:rPr>
+          <w:b w:val="false"/>
+          <w:bCs w:val="false"/>
+          <w:i w:val="false"/>
+          <w:iCs w:val="false"/>
+          <w:color w:val="000000"/>
+          <w:sz w:val="24"/>
+          <w:szCs w:val="24"/>
+          <w:rFonts w:ascii="Times New Roman" w:cs="Times New Roman" w:eastAsia="Times New Roman" w:hAnsi="Times New Roman"/>
+        </w:rPr>
+        <w:t xml:space="preserve"> est maître de la terre, juge suprême, chef religieux lié aux ancêtres royaux ; les grandes décisions s’annoncent au peuple assemblé — le </w:t>
+      </w:r>
+      <w:r>
+        <w:rPr>
+          <w:b/>
+          <w:bCs/>
+          <w:i w:val="false"/>
+          <w:iCs w:val="false"/>
+          <w:color w:val="1F4E79"/>
+          <w:sz w:val="24"/>
+          <w:szCs w:val="24"/>
+          <w:rFonts w:ascii="Times New Roman" w:cs="Times New Roman" w:eastAsia="Times New Roman" w:hAnsi="Times New Roman"/>
+        </w:rPr>
+        <w:t xml:space="preserve">kabary</w:t>
+      </w:r>
+      <w:r>
+        <w:rPr>
+          <w:b w:val="false"/>
+          <w:bCs w:val="false"/>
+          <w:i w:val="false"/>
+          <w:iCs w:val="false"/>
+          <w:color w:val="000000"/>
+          <w:sz w:val="24"/>
+          <w:szCs w:val="24"/>
+          <w:rFonts w:ascii="Times New Roman" w:cs="Times New Roman" w:eastAsia="Times New Roman" w:hAnsi="Times New Roman"/>
+        </w:rPr>
+        <w:t xml:space="preserve">. Sa puissance se mesure à ses </w:t>
+      </w:r>
+      <w:r>
+        <w:rPr>
+          <w:b/>
+          <w:bCs/>
+          <w:i w:val="false"/>
+          <w:iCs w:val="false"/>
+          <w:color w:val="1F4E79"/>
+          <w:sz w:val="24"/>
+          <w:szCs w:val="24"/>
+          <w:rFonts w:ascii="Times New Roman" w:cs="Times New Roman" w:eastAsia="Times New Roman" w:hAnsi="Times New Roman"/>
+        </w:rPr>
+        <w:t xml:space="preserve">expéditions militaires</w:t>
+      </w:r>
+      <w:r>
+        <w:rPr>
+          <w:b w:val="false"/>
+          <w:bCs w:val="false"/>
+          <w:i w:val="false"/>
+          <w:iCs w:val="false"/>
+          <w:color w:val="000000"/>
+          <w:sz w:val="24"/>
+          <w:szCs w:val="24"/>
+          <w:rFonts w:ascii="Times New Roman" w:cs="Times New Roman" w:eastAsia="Times New Roman" w:hAnsi="Times New Roman"/>
+        </w:rPr>
+        <w:t xml:space="preserve"> : les </w:t>
+      </w:r>
+      <w:r>
+        <w:rPr>
+          <w:b/>
+          <w:bCs/>
+          <w:i w:val="false"/>
+          <w:iCs w:val="false"/>
+          <w:color w:val="1F4E79"/>
+          <w:sz w:val="24"/>
+          <w:szCs w:val="24"/>
+          <w:rFonts w:ascii="Times New Roman" w:cs="Times New Roman" w:eastAsia="Times New Roman" w:hAnsi="Times New Roman"/>
+        </w:rPr>
+        <w:t xml:space="preserve">roi</w:t>
+      </w:r>
+      <w:r>
+        <w:rPr>
+          <w:b w:val="false"/>
+          <w:bCs w:val="false"/>
+          <w:i w:val="false"/>
+          <w:iCs w:val="false"/>
+          <w:color w:val="000000"/>
+          <w:sz w:val="24"/>
+          <w:szCs w:val="24"/>
+          <w:rFonts w:ascii="Times New Roman" w:cs="Times New Roman" w:eastAsia="Times New Roman" w:hAnsi="Times New Roman"/>
+        </w:rPr>
+        <w:t xml:space="preserve">s sakalava du Menabe puis du Boina soumettent l’ouest au XVIIᵉ siècle ; les </w:t>
+      </w:r>
+      <w:r>
+        <w:rPr>
+          <w:b/>
+          <w:bCs/>
+          <w:i w:val="false"/>
+          <w:iCs w:val="false"/>
+          <w:color w:val="1F4E79"/>
+          <w:sz w:val="24"/>
+          <w:szCs w:val="24"/>
+          <w:rFonts w:ascii="Times New Roman" w:cs="Times New Roman" w:eastAsia="Times New Roman" w:hAnsi="Times New Roman"/>
+        </w:rPr>
+        <w:t xml:space="preserve">roi</w:t>
+      </w:r>
+      <w:r>
+        <w:rPr>
+          <w:b w:val="false"/>
+          <w:bCs w:val="false"/>
+          <w:i w:val="false"/>
+          <w:iCs w:val="false"/>
+          <w:color w:val="000000"/>
+          <w:sz w:val="24"/>
+          <w:szCs w:val="24"/>
+          <w:rFonts w:ascii="Times New Roman" w:cs="Times New Roman" w:eastAsia="Times New Roman" w:hAnsi="Times New Roman"/>
+        </w:rPr>
+        <w:t xml:space="preserve">s merina, au tournant du XIXᵉ, unifient les Hautes Terres.</w:t>
+      </w:r>
+    </w:p>
+    <w:p>
+      <w:pPr>
+        <w:spacing w:after="100" w:line="300"/>
+        <w:jc w:val="both"/>
+      </w:pPr>
+      <w:r>
+        <w:rPr>
+          <w:b w:val="false"/>
+          <w:bCs w:val="false"/>
+          <w:i w:val="false"/>
+          <w:iCs w:val="false"/>
+          <w:color w:val="000000"/>
+          <w:sz w:val="24"/>
+          <w:szCs w:val="24"/>
+          <w:rFonts w:ascii="Times New Roman" w:cs="Times New Roman" w:eastAsia="Times New Roman" w:hAnsi="Times New Roman"/>
+        </w:rPr>
+        <w:t xml:space="preserve">Nos connaissances viennent des traditions orales et des récits des voyageurs — dont l’œuvre monumentale d’Alfred </w:t>
+      </w:r>
+      <w:r>
+        <w:rPr>
+          <w:b/>
+          <w:bCs/>
+          <w:i w:val="false"/>
+          <w:iCs w:val="false"/>
+          <w:color w:val="1F4E79"/>
+          <w:sz w:val="24"/>
+          <w:szCs w:val="24"/>
+          <w:rFonts w:ascii="Times New Roman" w:cs="Times New Roman" w:eastAsia="Times New Roman" w:hAnsi="Times New Roman"/>
+        </w:rPr>
+        <w:t xml:space="preserve">Grandidier</w:t>
+      </w:r>
+      <w:r>
+        <w:rPr>
+          <w:b w:val="false"/>
+          <w:bCs w:val="false"/>
+          <w:i w:val="false"/>
+          <w:iCs w:val="false"/>
+          <w:color w:val="000000"/>
+          <w:sz w:val="24"/>
+          <w:szCs w:val="24"/>
+          <w:rFonts w:ascii="Times New Roman" w:cs="Times New Roman" w:eastAsia="Times New Roman" w:hAnsi="Times New Roman"/>
+        </w:rPr>
+        <w:t xml:space="preserve">, qui décrivit l’île et ses sociétés au XIXᵉ siècle.</w:t>
       </w:r>
     </w:p>
     <w:p>
@@ -5764,8 +7309,331 @@
     </w:p>
     <w:p>
       <w:pPr>
-        <w:spacing w:before="200" w:after="150"/>
-        <w:jc w:val="left"/>
+        <w:spacing w:after="120"/>
+      </w:pPr>
+    </w:p>
+    <w:tbl>
+      <w:tblPr>
+        <w:tblW w:type="dxa" w:w="9600"/>
+        <w:tblBorders>
+          <w:top w:val="single" w:color="B25000" w:sz="12"/>
+          <w:left w:val="single" w:color="B25000" w:sz="12"/>
+          <w:bottom w:val="single" w:color="B25000" w:sz="12"/>
+          <w:right w:val="single" w:color="B25000" w:sz="12"/>
+          <w:insideH w:val="none"/>
+          <w:insideV w:val="none"/>
+        </w:tblBorders>
+        <w:tblLayout w:type="fixed"/>
+      </w:tblPr>
+      <w:tblGrid>
+        <w:gridCol w:w="9600"/>
+      </w:tblGrid>
+      <w:tr>
+        <w:tc>
+          <w:tcPr>
+            <w:shd w:fill="FFF8EF" w:val="clear"/>
+            <w:tcMar>
+              <w:top w:type="dxa" w:w="140"/>
+              <w:left w:type="dxa" w:w="180"/>
+              <w:bottom w:type="dxa" w:w="140"/>
+              <w:right w:type="dxa" w:w="180"/>
+            </w:tcMar>
+          </w:tcPr>
+          <w:p>
+            <w:pPr>
+              <w:spacing w:after="90"/>
+            </w:pPr>
+            <w:r>
+              <w:rPr>
+                <w:b/>
+                <w:bCs/>
+                <w:i w:val="false"/>
+                <w:iCs w:val="false"/>
+                <w:color w:val="B25000"/>
+                <w:sz w:val="25"/>
+                <w:szCs w:val="25"/>
+                <w:rFonts w:ascii="Times New Roman" w:cs="Times New Roman" w:eastAsia="Times New Roman" w:hAnsi="Times New Roman"/>
+              </w:rPr>
+              <w:t xml:space="preserve">Document à étudier</w:t>
+            </w:r>
+          </w:p>
+          <w:p>
+            <w:pPr>
+              <w:spacing w:after="80" w:line="300"/>
+              <w:jc w:val="left"/>
+            </w:pPr>
+            <w:r>
+              <w:rPr>
+                <w:b/>
+                <w:bCs/>
+                <w:i w:val="false"/>
+                <w:iCs w:val="false"/>
+                <w:color w:val="000000"/>
+                <w:sz w:val="21"/>
+                <w:szCs w:val="21"/>
+                <w:rFonts w:ascii="Times New Roman" w:cs="Times New Roman" w:eastAsia="Times New Roman" w:hAnsi="Times New Roman"/>
+              </w:rPr>
+              <w:t xml:space="preserve">Le pouvoir des rois sakalava — d’après Alfred et Guillaume Grandidier, Histoire physique, naturelle et politique de Madagascar (fin XIXᵉ siècle) — extrait adapté</w:t>
+            </w:r>
+          </w:p>
+          <w:p>
+            <w:pPr>
+              <w:spacing w:after="100" w:line="300"/>
+              <w:jc w:val="both"/>
+            </w:pPr>
+            <w:r>
+              <w:rPr>
+                <w:b w:val="false"/>
+                <w:bCs w:val="false"/>
+                <w:i/>
+                <w:iCs/>
+                <w:color w:val="000000"/>
+                <w:sz w:val="24"/>
+                <w:szCs w:val="24"/>
+                <w:rFonts w:ascii="Times New Roman" w:cs="Times New Roman" w:eastAsia="Times New Roman" w:hAnsi="Times New Roman"/>
+              </w:rPr>
+              <w:t xml:space="preserve">« Chez les Sakalava, le souverain, que l’on nomme ampanjaka, est l’objet d’un profond respect : il descend des rois fondateurs, dont les reliques sont pieusement conservées et honorées. Nul ne possède la terre que par lui ; nul procès important ne se juge sans lui. Sa richesse se compte en troupeaux de bœufs, et sa puissance au nombre de ses guerriers. Les rois du Boina tiraient en outre de grands profits du commerce avec les navires : ils fournissaient des bœufs et des esclaves, et recevaient en retour des fusils, de la poudre et des piastres, qui accroissaient encore leur autorité. »</w:t>
+            </w:r>
+          </w:p>
+          <w:p>
+            <w:pPr>
+              <w:spacing w:after="40" w:line="300"/>
+              <w:jc w:val="both"/>
+            </w:pPr>
+            <w:r>
+              <w:rPr>
+                <w:b w:val="false"/>
+                <w:bCs w:val="false"/>
+                <w:i w:val="false"/>
+                <w:iCs w:val="false"/>
+                <w:color w:val="000000"/>
+                <w:sz w:val="24"/>
+                <w:szCs w:val="24"/>
+                <w:rFonts w:ascii="Times New Roman" w:cs="Times New Roman" w:eastAsia="Times New Roman" w:hAnsi="Times New Roman"/>
+              </w:rPr>
+              <w:t xml:space="preserve">1. Relève les trois fondements du pouvoir de l’ampanjaka.</w:t>
+            </w:r>
+          </w:p>
+          <w:p>
+            <w:pPr>
+              <w:spacing w:after="40" w:line="300"/>
+              <w:jc w:val="both"/>
+            </w:pPr>
+            <w:r>
+              <w:rPr>
+                <w:b w:val="false"/>
+                <w:bCs w:val="false"/>
+                <w:i w:val="false"/>
+                <w:iCs w:val="false"/>
+                <w:color w:val="000000"/>
+                <w:sz w:val="24"/>
+                <w:szCs w:val="24"/>
+                <w:rFonts w:ascii="Times New Roman" w:cs="Times New Roman" w:eastAsia="Times New Roman" w:hAnsi="Times New Roman"/>
+              </w:rPr>
+              <w:t xml:space="preserve">2. Comment le commerce avec les navires renforce-t-il la puissance royale ?</w:t>
+            </w:r>
+          </w:p>
+          <w:p>
+            <w:pPr>
+              <w:spacing w:after="40" w:line="300"/>
+              <w:jc w:val="both"/>
+            </w:pPr>
+            <w:r>
+              <w:rPr>
+                <w:b w:val="false"/>
+                <w:bCs w:val="false"/>
+                <w:i w:val="false"/>
+                <w:iCs w:val="false"/>
+                <w:color w:val="000000"/>
+                <w:sz w:val="24"/>
+                <w:szCs w:val="24"/>
+                <w:rFonts w:ascii="Times New Roman" w:cs="Times New Roman" w:eastAsia="Times New Roman" w:hAnsi="Times New Roman"/>
+              </w:rPr>
+              <w:t xml:space="preserve">3. Ce texte d’un savant européen suffit-il à l’historien ? Justifie.</w:t>
+            </w:r>
+          </w:p>
+          <w:p>
+            <w:pPr>
+              <w:spacing w:after="60"/>
+            </w:pPr>
+          </w:p>
+          <w:p>
+            <w:pPr>
+              <w:spacing w:after="40"/>
+            </w:pPr>
+            <w:r>
+              <w:rPr>
+                <w:b/>
+                <w:bCs/>
+                <w:i w:val="false"/>
+                <w:iCs w:val="false"/>
+                <w:color w:val="C2185B"/>
+                <w:sz w:val="22"/>
+                <w:szCs w:val="22"/>
+                <w:rFonts w:ascii="Times New Roman" w:cs="Times New Roman" w:eastAsia="Times New Roman" w:hAnsi="Times New Roman"/>
+              </w:rPr>
+              <w:t xml:space="preserve">Réponse 1. </w:t>
+            </w:r>
+            <w:r>
+              <w:rPr>
+                <w:b w:val="false"/>
+                <w:bCs w:val="false"/>
+                <w:i w:val="false"/>
+                <w:iCs w:val="false"/>
+                <w:color w:val="000000"/>
+                <w:sz w:val="22"/>
+                <w:szCs w:val="22"/>
+                <w:rFonts w:ascii="Times New Roman" w:cs="Times New Roman" w:eastAsia="Times New Roman" w:hAnsi="Times New Roman"/>
+              </w:rPr>
+              <w:t xml:space="preserve">Le fondement religieux (descendance des rois fondateurs, reliques honorées), le fondement économique (maître de la terre, troupeaux), le fondement politique et judiciaire (juge des procès, chef des guerriers).</w:t>
+            </w:r>
+          </w:p>
+          <w:p>
+            <w:pPr>
+              <w:spacing w:after="40"/>
+            </w:pPr>
+            <w:r>
+              <w:rPr>
+                <w:b/>
+                <w:bCs/>
+                <w:i w:val="false"/>
+                <w:iCs w:val="false"/>
+                <w:color w:val="C2185B"/>
+                <w:sz w:val="22"/>
+                <w:szCs w:val="22"/>
+                <w:rFonts w:ascii="Times New Roman" w:cs="Times New Roman" w:eastAsia="Times New Roman" w:hAnsi="Times New Roman"/>
+              </w:rPr>
+              <w:t xml:space="preserve">Réponse 2. </w:t>
+            </w:r>
+            <w:r>
+              <w:rPr>
+                <w:b w:val="false"/>
+                <w:bCs w:val="false"/>
+                <w:i w:val="false"/>
+                <w:iCs w:val="false"/>
+                <w:color w:val="000000"/>
+                <w:sz w:val="22"/>
+                <w:szCs w:val="22"/>
+                <w:rFonts w:ascii="Times New Roman" w:cs="Times New Roman" w:eastAsia="Times New Roman" w:hAnsi="Times New Roman"/>
+              </w:rPr>
+              <w:t xml:space="preserve">Les fusils et la poudre reçus contre bœufs et captifs arment ses guerriers : le roi peut lancer de nouvelles expéditions — le commerce nourrit la force militaire, qui nourrit le commerce.</w:t>
+            </w:r>
+          </w:p>
+          <w:p>
+            <w:pPr>
+              <w:spacing w:after="40"/>
+            </w:pPr>
+            <w:r>
+              <w:rPr>
+                <w:b/>
+                <w:bCs/>
+                <w:i w:val="false"/>
+                <w:iCs w:val="false"/>
+                <w:color w:val="C2185B"/>
+                <w:sz w:val="22"/>
+                <w:szCs w:val="22"/>
+                <w:rFonts w:ascii="Times New Roman" w:cs="Times New Roman" w:eastAsia="Times New Roman" w:hAnsi="Times New Roman"/>
+              </w:rPr>
+              <w:t xml:space="preserve">Réponse 3. </w:t>
+            </w:r>
+            <w:r>
+              <w:rPr>
+                <w:b w:val="false"/>
+                <w:bCs w:val="false"/>
+                <w:i w:val="false"/>
+                <w:iCs w:val="false"/>
+                <w:color w:val="000000"/>
+                <w:sz w:val="22"/>
+                <w:szCs w:val="22"/>
+                <w:rFonts w:ascii="Times New Roman" w:cs="Times New Roman" w:eastAsia="Times New Roman" w:hAnsi="Times New Roman"/>
+              </w:rPr>
+              <w:t xml:space="preserve">Non : c’est un regard extérieur, à croiser avec les traditions orales malgaches et les autres témoignages — c’est la règle du métier d’historien.</w:t>
+            </w:r>
+          </w:p>
+        </w:tc>
+      </w:tr>
+    </w:tbl>
+    <w:p>
+      <w:pPr>
+        <w:spacing w:after="160"/>
+      </w:pPr>
+    </w:p>
+    <w:tbl>
+      <w:tblPr>
+        <w:tblW w:type="dxa" w:w="9600"/>
+        <w:tblBorders>
+          <w:top w:val="single" w:color="1565C0" w:sz="12"/>
+          <w:left w:val="single" w:color="1565C0" w:sz="12"/>
+          <w:bottom w:val="single" w:color="1565C0" w:sz="12"/>
+          <w:right w:val="single" w:color="1565C0" w:sz="12"/>
+          <w:insideH w:val="none"/>
+          <w:insideV w:val="none"/>
+        </w:tblBorders>
+        <w:tblLayout w:type="fixed"/>
+      </w:tblPr>
+      <w:tblGrid>
+        <w:gridCol w:w="9600"/>
+      </w:tblGrid>
+      <w:tr>
+        <w:tc>
+          <w:tcPr>
+            <w:shd w:fill="E3F2FD" w:val="clear"/>
+            <w:tcMar>
+              <w:top w:type="dxa" w:w="140"/>
+              <w:left w:type="dxa" w:w="180"/>
+              <w:bottom w:type="dxa" w:w="140"/>
+              <w:right w:type="dxa" w:w="180"/>
+            </w:tcMar>
+          </w:tcPr>
+          <w:p>
+            <w:pPr>
+              <w:spacing w:after="90"/>
+            </w:pPr>
+            <w:r>
+              <w:rPr>
+                <w:b/>
+                <w:bCs/>
+                <w:i w:val="false"/>
+                <w:iCs w:val="false"/>
+                <w:color w:val="1565C0"/>
+                <w:sz w:val="25"/>
+                <w:szCs w:val="25"/>
+                <w:rFonts w:ascii="Times New Roman" w:cs="Times New Roman" w:eastAsia="Times New Roman" w:hAnsi="Times New Roman"/>
+              </w:rPr>
+              <w:t xml:space="preserve">Le savais-tu ?</w:t>
+            </w:r>
+          </w:p>
+          <w:p>
+            <w:pPr>
+              <w:spacing w:after="0" w:line="300"/>
+              <w:jc w:val="both"/>
+            </w:pPr>
+            <w:r>
+              <w:rPr>
+                <w:b w:val="false"/>
+                <w:bCs w:val="false"/>
+                <w:i w:val="false"/>
+                <w:iCs w:val="false"/>
+                <w:color w:val="000000"/>
+                <w:sz w:val="22"/>
+                <w:szCs w:val="22"/>
+                <w:rFonts w:ascii="Times New Roman" w:cs="Times New Roman" w:eastAsia="Times New Roman" w:hAnsi="Times New Roman"/>
+              </w:rPr>
+              <w:t xml:space="preserve">Alfred Grandidier a consacré sa vie entière à Madagascar : arrivé en 1865, il parcourt l’île pendant des années, relève cartes, langues, coutumes et traditions royales, puis publie avec son fils Guillaume une « Histoire physique, naturelle et politique de Madagascar » en… 39 volumes ! Cette somme reste une source majeure — à croiser, comme toujours, avec les traditions orales malgaches.</w:t>
+            </w:r>
+          </w:p>
+        </w:tc>
+      </w:tr>
+    </w:tbl>
+    <w:p>
+      <w:pPr>
+        <w:spacing w:after="160"/>
+      </w:pPr>
+    </w:p>
+    <w:p>
+      <w:pPr>
+        <w:spacing w:after="80" w:line="300"/>
+        <w:jc w:val="both"/>
       </w:pPr>
       <w:r>
         <w:rPr>
@@ -5774,166 +7642,337 @@
           <w:i w:val="false"/>
           <w:iCs w:val="false"/>
           <w:color w:val="2E7D32"/>
-          <w:sz w:val="28"/>
-          <w:szCs w:val="28"/>
-          <w:rFonts w:ascii="Times New Roman" w:cs="Times New Roman" w:eastAsia="Times New Roman" w:hAnsi="Times New Roman"/>
-        </w:rPr>
-        <w:t xml:space="preserve">Méthode</w:t>
-      </w:r>
-    </w:p>
-    <w:p>
-      <w:pPr>
-        <w:spacing w:after="60" w:line="300"/>
-        <w:jc w:val="both"/>
-      </w:pPr>
-      <w:r>
-        <w:rPr>
-          <w:b w:val="false"/>
-          <w:bCs w:val="false"/>
-          <w:i w:val="false"/>
-          <w:iCs w:val="false"/>
-          <w:color w:val="000000"/>
-          <w:sz w:val="24"/>
-          <w:szCs w:val="24"/>
-          <w:rFonts w:ascii="Times New Roman" w:cs="Times New Roman" w:eastAsia="Times New Roman" w:hAnsi="Times New Roman"/>
-        </w:rPr>
-        <w:t xml:space="preserve">1. Présenter la société par les trois castes, avec les noms merina et l’idée d’appellations régionales.</w:t>
-      </w:r>
-    </w:p>
-    <w:p>
-      <w:pPr>
-        <w:spacing w:after="60" w:line="300"/>
-        <w:jc w:val="both"/>
-      </w:pPr>
-      <w:r>
-        <w:rPr>
-          <w:b w:val="false"/>
-          <w:bCs w:val="false"/>
-          <w:i w:val="false"/>
-          <w:iCs w:val="false"/>
-          <w:color w:val="000000"/>
-          <w:sz w:val="24"/>
-          <w:szCs w:val="24"/>
-          <w:rFonts w:ascii="Times New Roman" w:cs="Times New Roman" w:eastAsia="Times New Roman" w:hAnsi="Times New Roman"/>
-        </w:rPr>
-        <w:t xml:space="preserve">2. Décrire l’économie en deux volets : vivrier (riz, zébus) et traite.</w:t>
-      </w:r>
-    </w:p>
-    <w:p>
-      <w:pPr>
-        <w:spacing w:after="60" w:line="300"/>
-        <w:jc w:val="both"/>
-      </w:pPr>
-      <w:r>
-        <w:rPr>
-          <w:b w:val="false"/>
-          <w:bCs w:val="false"/>
-          <w:i w:val="false"/>
-          <w:iCs w:val="false"/>
-          <w:color w:val="000000"/>
-          <w:sz w:val="24"/>
-          <w:szCs w:val="24"/>
-          <w:rFonts w:ascii="Times New Roman" w:cs="Times New Roman" w:eastAsia="Times New Roman" w:hAnsi="Times New Roman"/>
-        </w:rPr>
-        <w:t xml:space="preserve">3. Montrer le rôle du roi : centre religieux, judiciaire et militaire du royaume.</w:t>
-      </w:r>
-    </w:p>
-    <w:p>
-      <w:pPr>
-        <w:spacing w:after="110" w:line="300"/>
-        <w:jc w:val="both"/>
-      </w:pPr>
-      <w:r>
-        <w:rPr>
-          <w:b/>
-          <w:bCs/>
-          <w:i w:val="false"/>
-          <w:iCs w:val="false"/>
-          <w:color w:val="1F4E79"/>
-          <w:sz w:val="24"/>
-          <w:szCs w:val="24"/>
-          <w:rFonts w:ascii="Times New Roman" w:cs="Times New Roman" w:eastAsia="Times New Roman" w:hAnsi="Times New Roman"/>
-        </w:rPr>
-        <w:t xml:space="preserve">Exemple — </w:t>
-      </w:r>
-      <w:r>
-        <w:rPr>
-          <w:b w:val="false"/>
-          <w:bCs w:val="false"/>
-          <w:i w:val="false"/>
-          <w:iCs w:val="false"/>
-          <w:color w:val="000000"/>
-          <w:sz w:val="24"/>
-          <w:szCs w:val="24"/>
-          <w:rFonts w:ascii="Times New Roman" w:cs="Times New Roman" w:eastAsia="Times New Roman" w:hAnsi="Times New Roman"/>
-        </w:rPr>
-        <w:t xml:space="preserve">Un roi du Boina au XVIIIᵉ siècle : il vend 200 captifs à un navire européen, reçoit 300 fusils, arme ses guerriers, lance une expédition vers l’intérieur — qui ramène de nouveaux captifs. Le cercle traite-guerre tourne, et le royaume s’étend.</w:t>
-      </w:r>
-    </w:p>
-    <w:p>
-      <w:pPr>
-        <w:spacing w:after="110" w:line="300"/>
-        <w:jc w:val="both"/>
-      </w:pPr>
-      <w:r>
-        <w:rPr>
-          <w:b/>
-          <w:bCs/>
-          <w:i w:val="false"/>
-          <w:iCs w:val="false"/>
-          <w:color w:val="B25000"/>
-          <w:sz w:val="24"/>
-          <w:szCs w:val="24"/>
-          <w:rFonts w:ascii="Times New Roman" w:cs="Times New Roman" w:eastAsia="Times New Roman" w:hAnsi="Times New Roman"/>
-        </w:rPr>
-        <w:t xml:space="preserve">Erreur à éviter — </w:t>
-      </w:r>
-      <w:r>
-        <w:rPr>
-          <w:b w:val="false"/>
-          <w:bCs w:val="false"/>
-          <w:i w:val="false"/>
-          <w:iCs w:val="false"/>
-          <w:color w:val="000000"/>
-          <w:sz w:val="24"/>
-          <w:szCs w:val="24"/>
-          <w:rFonts w:ascii="Times New Roman" w:cs="Times New Roman" w:eastAsia="Times New Roman" w:hAnsi="Times New Roman"/>
-        </w:rPr>
-        <w:t xml:space="preserve">Projeter la société d’aujourd’hui sur celle d’hier : les castes anciennes relevaient d’un ordre juridique et religieux aboli depuis longtemps — l’esclavage a été aboli à Madagascar en 1896. L’historien décrit ces hiérarchies pour comprendre le passé, jamais pour les justifier.</w:t>
-      </w:r>
-    </w:p>
-    <w:p>
-      <w:pPr>
-        <w:shd w:fill="E3F2FD" w:val="clear"/>
-        <w:spacing w:after="110" w:line="300"/>
-        <w:jc w:val="both"/>
-      </w:pPr>
-      <w:r>
-        <w:rPr>
-          <w:b/>
-          <w:bCs/>
-          <w:i w:val="false"/>
-          <w:iCs w:val="false"/>
-          <w:color w:val="1565C0"/>
-          <w:sz w:val="24"/>
-          <w:szCs w:val="24"/>
-          <w:rFonts w:ascii="Times New Roman" w:cs="Times New Roman" w:eastAsia="Times New Roman" w:hAnsi="Times New Roman"/>
-        </w:rPr>
-        <w:t xml:space="preserve">Le savais-tu ? </w:t>
-      </w:r>
-      <w:r>
-        <w:rPr>
-          <w:b w:val="false"/>
-          <w:bCs w:val="false"/>
-          <w:i w:val="false"/>
-          <w:iCs w:val="false"/>
-          <w:color w:val="000000"/>
-          <w:sz w:val="24"/>
-          <w:szCs w:val="24"/>
-          <w:rFonts w:ascii="Times New Roman" w:cs="Times New Roman" w:eastAsia="Times New Roman" w:hAnsi="Times New Roman"/>
-        </w:rPr>
-        <w:t xml:space="preserve">Alfred Grandidier a consacré sa vie entière à Madagascar : arrivé en 1865, il parcourt l’île pendant des années, relève cartes, langues, coutumes et traditions royales, puis publie avec son fils Guillaume une « Histoire physique, naturelle et politique de Madagascar » en… 39 volumes ! Cette somme reste une source majeure — à croiser, comme toujours, avec les traditions orales malgaches.</w:t>
-      </w:r>
+          <w:sz w:val="26"/>
+          <w:szCs w:val="26"/>
+          <w:rFonts w:ascii="Times New Roman" w:cs="Times New Roman" w:eastAsia="Times New Roman" w:hAnsi="Times New Roman"/>
+        </w:rPr>
+        <w:t xml:space="preserve">Petit lexique</w:t>
+      </w:r>
+    </w:p>
+    <w:tbl>
+      <w:tblPr>
+        <w:tblW w:type="dxa" w:w="9600"/>
+        <w:tblBorders>
+          <w:top w:val="single" w:color="808080" w:sz="4"/>
+          <w:left w:val="single" w:color="808080" w:sz="4"/>
+          <w:bottom w:val="single" w:color="808080" w:sz="4"/>
+          <w:right w:val="single" w:color="808080" w:sz="4"/>
+          <w:insideH w:val="single" w:color="B0B0B0" w:sz="4"/>
+          <w:insideV w:val="single" w:color="B0B0B0" w:sz="4"/>
+        </w:tblBorders>
+        <w:tblLayout w:type="fixed"/>
+      </w:tblPr>
+      <w:tblGrid>
+        <w:gridCol w:w="2800"/>
+        <w:gridCol w:w="6800"/>
+      </w:tblGrid>
+      <w:tr>
+        <w:tc>
+          <w:tcPr>
+            <w:shd w:fill="E7E6E6" w:val="clear"/>
+            <w:tcMar>
+              <w:top w:type="dxa" w:w="80"/>
+              <w:left w:type="dxa" w:w="80"/>
+              <w:bottom w:type="dxa" w:w="80"/>
+              <w:right w:type="dxa" w:w="80"/>
+            </w:tcMar>
+          </w:tcPr>
+          <w:p>
+            <w:pPr>
+              <w:spacing w:after="40"/>
+              <w:jc w:val="left"/>
+            </w:pPr>
+            <w:r>
+              <w:rPr>
+                <w:b/>
+                <w:bCs/>
+                <w:i w:val="false"/>
+                <w:iCs w:val="false"/>
+                <w:color w:val="000000"/>
+                <w:sz w:val="20"/>
+                <w:szCs w:val="20"/>
+                <w:rFonts w:ascii="Times New Roman" w:cs="Times New Roman" w:eastAsia="Times New Roman" w:hAnsi="Times New Roman"/>
+              </w:rPr>
+              <w:t xml:space="preserve">Mot</w:t>
+            </w:r>
+          </w:p>
+        </w:tc>
+        <w:tc>
+          <w:tcPr>
+            <w:shd w:fill="E7E6E6" w:val="clear"/>
+            <w:tcMar>
+              <w:top w:type="dxa" w:w="80"/>
+              <w:left w:type="dxa" w:w="80"/>
+              <w:bottom w:type="dxa" w:w="80"/>
+              <w:right w:type="dxa" w:w="80"/>
+            </w:tcMar>
+          </w:tcPr>
+          <w:p>
+            <w:pPr>
+              <w:spacing w:after="40"/>
+              <w:jc w:val="left"/>
+            </w:pPr>
+            <w:r>
+              <w:rPr>
+                <w:b/>
+                <w:bCs/>
+                <w:i w:val="false"/>
+                <w:iCs w:val="false"/>
+                <w:color w:val="000000"/>
+                <w:sz w:val="20"/>
+                <w:szCs w:val="20"/>
+                <w:rFonts w:ascii="Times New Roman" w:cs="Times New Roman" w:eastAsia="Times New Roman" w:hAnsi="Times New Roman"/>
+              </w:rPr>
+              <w:t xml:space="preserve">Sens</w:t>
+            </w:r>
+          </w:p>
+        </w:tc>
+      </w:tr>
+      <w:tr>
+        <w:tc>
+          <w:tcPr>
+            <w:tcMar>
+              <w:top w:type="dxa" w:w="80"/>
+              <w:left w:type="dxa" w:w="80"/>
+              <w:bottom w:type="dxa" w:w="80"/>
+              <w:right w:type="dxa" w:w="80"/>
+            </w:tcMar>
+          </w:tcPr>
+          <w:p>
+            <w:pPr>
+              <w:spacing w:after="40"/>
+              <w:jc w:val="left"/>
+            </w:pPr>
+            <w:r>
+              <w:rPr>
+                <w:b/>
+                <w:bCs/>
+                <w:i w:val="false"/>
+                <w:iCs w:val="false"/>
+                <w:color w:val="000000"/>
+                <w:sz w:val="20"/>
+                <w:szCs w:val="20"/>
+                <w:rFonts w:ascii="Times New Roman" w:cs="Times New Roman" w:eastAsia="Times New Roman" w:hAnsi="Times New Roman"/>
+              </w:rPr>
+              <w:t xml:space="preserve">Caste</w:t>
+            </w:r>
+          </w:p>
+        </w:tc>
+        <w:tc>
+          <w:tcPr>
+            <w:tcMar>
+              <w:top w:type="dxa" w:w="80"/>
+              <w:left w:type="dxa" w:w="80"/>
+              <w:bottom w:type="dxa" w:w="80"/>
+              <w:right w:type="dxa" w:w="80"/>
+            </w:tcMar>
+          </w:tcPr>
+          <w:p>
+            <w:pPr>
+              <w:spacing w:after="40"/>
+              <w:jc w:val="left"/>
+            </w:pPr>
+            <w:r>
+              <w:rPr>
+                <w:b w:val="false"/>
+                <w:bCs w:val="false"/>
+                <w:i w:val="false"/>
+                <w:iCs w:val="false"/>
+                <w:color w:val="000000"/>
+                <w:sz w:val="20"/>
+                <w:szCs w:val="20"/>
+                <w:rFonts w:ascii="Times New Roman" w:cs="Times New Roman" w:eastAsia="Times New Roman" w:hAnsi="Times New Roman"/>
+              </w:rPr>
+              <w:t xml:space="preserve">groupe social héréditaire que l’on ne peut quitter</w:t>
+            </w:r>
+          </w:p>
+        </w:tc>
+      </w:tr>
+      <w:tr>
+        <w:tc>
+          <w:tcPr>
+            <w:tcMar>
+              <w:top w:type="dxa" w:w="80"/>
+              <w:left w:type="dxa" w:w="80"/>
+              <w:bottom w:type="dxa" w:w="80"/>
+              <w:right w:type="dxa" w:w="80"/>
+            </w:tcMar>
+          </w:tcPr>
+          <w:p>
+            <w:pPr>
+              <w:spacing w:after="40"/>
+              <w:jc w:val="left"/>
+            </w:pPr>
+            <w:r>
+              <w:rPr>
+                <w:b/>
+                <w:bCs/>
+                <w:i w:val="false"/>
+                <w:iCs w:val="false"/>
+                <w:color w:val="000000"/>
+                <w:sz w:val="20"/>
+                <w:szCs w:val="20"/>
+                <w:rFonts w:ascii="Times New Roman" w:cs="Times New Roman" w:eastAsia="Times New Roman" w:hAnsi="Times New Roman"/>
+              </w:rPr>
+              <w:t xml:space="preserve">Ampanjaka</w:t>
+            </w:r>
+          </w:p>
+        </w:tc>
+        <w:tc>
+          <w:tcPr>
+            <w:tcMar>
+              <w:top w:type="dxa" w:w="80"/>
+              <w:left w:type="dxa" w:w="80"/>
+              <w:bottom w:type="dxa" w:w="80"/>
+              <w:right w:type="dxa" w:w="80"/>
+            </w:tcMar>
+          </w:tcPr>
+          <w:p>
+            <w:pPr>
+              <w:spacing w:after="40"/>
+              <w:jc w:val="left"/>
+            </w:pPr>
+            <w:r>
+              <w:rPr>
+                <w:b w:val="false"/>
+                <w:bCs w:val="false"/>
+                <w:i w:val="false"/>
+                <w:iCs w:val="false"/>
+                <w:color w:val="000000"/>
+                <w:sz w:val="20"/>
+                <w:szCs w:val="20"/>
+                <w:rFonts w:ascii="Times New Roman" w:cs="Times New Roman" w:eastAsia="Times New Roman" w:hAnsi="Times New Roman"/>
+              </w:rPr>
+              <w:t xml:space="preserve">souverain, noble régnant chez les Sakalava</w:t>
+            </w:r>
+          </w:p>
+        </w:tc>
+      </w:tr>
+      <w:tr>
+        <w:tc>
+          <w:tcPr>
+            <w:tcMar>
+              <w:top w:type="dxa" w:w="80"/>
+              <w:left w:type="dxa" w:w="80"/>
+              <w:bottom w:type="dxa" w:w="80"/>
+              <w:right w:type="dxa" w:w="80"/>
+            </w:tcMar>
+          </w:tcPr>
+          <w:p>
+            <w:pPr>
+              <w:spacing w:after="40"/>
+              <w:jc w:val="left"/>
+            </w:pPr>
+            <w:r>
+              <w:rPr>
+                <w:b/>
+                <w:bCs/>
+                <w:i w:val="false"/>
+                <w:iCs w:val="false"/>
+                <w:color w:val="000000"/>
+                <w:sz w:val="20"/>
+                <w:szCs w:val="20"/>
+                <w:rFonts w:ascii="Times New Roman" w:cs="Times New Roman" w:eastAsia="Times New Roman" w:hAnsi="Times New Roman"/>
+              </w:rPr>
+              <w:t xml:space="preserve">Traite</w:t>
+            </w:r>
+          </w:p>
+        </w:tc>
+        <w:tc>
+          <w:tcPr>
+            <w:tcMar>
+              <w:top w:type="dxa" w:w="80"/>
+              <w:left w:type="dxa" w:w="80"/>
+              <w:bottom w:type="dxa" w:w="80"/>
+              <w:right w:type="dxa" w:w="80"/>
+            </w:tcMar>
+          </w:tcPr>
+          <w:p>
+            <w:pPr>
+              <w:spacing w:after="40"/>
+              <w:jc w:val="left"/>
+            </w:pPr>
+            <w:r>
+              <w:rPr>
+                <w:b w:val="false"/>
+                <w:bCs w:val="false"/>
+                <w:i w:val="false"/>
+                <w:iCs w:val="false"/>
+                <w:color w:val="000000"/>
+                <w:sz w:val="20"/>
+                <w:szCs w:val="20"/>
+                <w:rFonts w:ascii="Times New Roman" w:cs="Times New Roman" w:eastAsia="Times New Roman" w:hAnsi="Times New Roman"/>
+              </w:rPr>
+              <w:t xml:space="preserve">commerce d’êtres humains réduits en esclavage</w:t>
+            </w:r>
+          </w:p>
+        </w:tc>
+      </w:tr>
+      <w:tr>
+        <w:tc>
+          <w:tcPr>
+            <w:tcMar>
+              <w:top w:type="dxa" w:w="80"/>
+              <w:left w:type="dxa" w:w="80"/>
+              <w:bottom w:type="dxa" w:w="80"/>
+              <w:right w:type="dxa" w:w="80"/>
+            </w:tcMar>
+          </w:tcPr>
+          <w:p>
+            <w:pPr>
+              <w:spacing w:after="40"/>
+              <w:jc w:val="left"/>
+            </w:pPr>
+            <w:r>
+              <w:rPr>
+                <w:b/>
+                <w:bCs/>
+                <w:i w:val="false"/>
+                <w:iCs w:val="false"/>
+                <w:color w:val="000000"/>
+                <w:sz w:val="20"/>
+                <w:szCs w:val="20"/>
+                <w:rFonts w:ascii="Times New Roman" w:cs="Times New Roman" w:eastAsia="Times New Roman" w:hAnsi="Times New Roman"/>
+              </w:rPr>
+              <w:t xml:space="preserve">Kabary</w:t>
+            </w:r>
+          </w:p>
+        </w:tc>
+        <w:tc>
+          <w:tcPr>
+            <w:tcMar>
+              <w:top w:type="dxa" w:w="80"/>
+              <w:left w:type="dxa" w:w="80"/>
+              <w:bottom w:type="dxa" w:w="80"/>
+              <w:right w:type="dxa" w:w="80"/>
+            </w:tcMar>
+          </w:tcPr>
+          <w:p>
+            <w:pPr>
+              <w:spacing w:after="40"/>
+              <w:jc w:val="left"/>
+            </w:pPr>
+            <w:r>
+              <w:rPr>
+                <w:b w:val="false"/>
+                <w:bCs w:val="false"/>
+                <w:i w:val="false"/>
+                <w:iCs w:val="false"/>
+                <w:color w:val="000000"/>
+                <w:sz w:val="20"/>
+                <w:szCs w:val="20"/>
+                <w:rFonts w:ascii="Times New Roman" w:cs="Times New Roman" w:eastAsia="Times New Roman" w:hAnsi="Times New Roman"/>
+              </w:rPr>
+              <w:t xml:space="preserve">discours solennel du souverain devant le peuple assemblé</w:t>
+            </w:r>
+          </w:p>
+        </w:tc>
+      </w:tr>
+    </w:tbl>
+    <w:p>
+      <w:pPr>
+        <w:spacing w:after="120"/>
+      </w:pPr>
     </w:p>
     <w:p>
       <w:pPr>

</xml_diff>